<commit_message>
Realizo correcciones de sintaxis SQL en consultas INNER JOIN y Inconsistencias de datos
</commit_message>
<xml_diff>
--- a/evidenicias/VELASCO_ROLANDO_EVIDENCIAS_SEMANA3.docx
+++ b/evidenicias/VELASCO_ROLANDO_EVIDENCIAS_SEMANA3.docx
@@ -50,7 +50,7 @@
                     </pic:cNvPicPr>
                   </pic:nvPicPr>
                   <pic:blipFill>
-                    <a:blip r:embed="rId7" cstate="print">
+                    <a:blip r:embed="rId8" cstate="print">
                       <a:extLst>
                         <a:ext uri="{28A0092B-C50C-407E-A947-70E740481C1C}">
                           <a14:useLocalDpi xmlns:a14="http://schemas.microsoft.com/office/drawing/2010/main" val="0"/>
@@ -251,7 +251,6 @@
           <w:color w:val="000000"/>
           <w:sz w:val="22"/>
           <w:szCs w:val="22"/>
-          <w:u w:val="single"/>
         </w:rPr>
       </w:pPr>
       <w:r>
@@ -261,16 +260,7 @@
           <w:sz w:val="22"/>
           <w:szCs w:val="22"/>
         </w:rPr>
-        <w:t xml:space="preserve">DOCUMENTO DE EVIDENCIAS – SEMANA </w:t>
-      </w:r>
-      <w:r>
-        <w:rPr>
-          <w:rFonts w:ascii="Arial" w:eastAsia="Arial" w:hAnsi="Arial" w:cs="Arial"/>
-          <w:color w:val="000000"/>
-          <w:sz w:val="22"/>
-          <w:szCs w:val="22"/>
-        </w:rPr>
-        <w:t>3</w:t>
+        <w:t>CONSULTAS, VALIDACIÓN Y CONSOLIDACIÓN DE LA BASE DE DATOS</w:t>
       </w:r>
     </w:p>
     <w:p>
@@ -289,6 +279,7 @@
           <w:color w:val="000000"/>
           <w:sz w:val="22"/>
           <w:szCs w:val="22"/>
+          <w:u w:val="single"/>
         </w:rPr>
       </w:pPr>
     </w:p>
@@ -689,6 +680,13 @@
         <w:t xml:space="preserve">ÍNDICE </w:t>
       </w:r>
     </w:p>
+    <w:p>
+      <w:pPr>
+        <w:rPr>
+          <w:u w:val="single"/>
+        </w:rPr>
+      </w:pPr>
+    </w:p>
     <w:p/>
     <w:p/>
     <w:p/>
@@ -719,7 +717,6 @@
         <w:pStyle w:val="Ttulo1"/>
       </w:pPr>
       <w:r>
-        <w:lastRenderedPageBreak/>
         <w:t>TABLA DE FIGURAS</w:t>
       </w:r>
     </w:p>
@@ -750,132 +747,1412 @@
         <w:t xml:space="preserve"> </w:t>
       </w:r>
     </w:p>
+    <w:p/>
+    <w:p/>
+    <w:p/>
+    <w:p/>
+    <w:p/>
+    <w:p/>
+    <w:p/>
+    <w:p/>
+    <w:p/>
+    <w:p/>
+    <w:p/>
+    <w:p/>
+    <w:p/>
+    <w:p/>
+    <w:p/>
+    <w:p/>
+    <w:p/>
+    <w:p/>
+    <w:p/>
+    <w:p/>
+    <w:p/>
+    <w:p/>
+    <w:p/>
+    <w:p/>
     <w:p>
       <w:pPr>
         <w:pStyle w:val="Ttulo1"/>
       </w:pPr>
       <w:r>
-        <w:t>2. OBJETIVO D LA ACTIVIDAD</w:t>
-      </w:r>
-    </w:p>
-    <w:p>
-      <w:pPr>
-        <w:pStyle w:val="Ttulo1"/>
-      </w:pPr>
-      <w:r>
-        <w:t>2. DATOS DEL ESTUDIANTE Y ROL</w:t>
-      </w:r>
-    </w:p>
-    <w:p>
-      <w:pPr>
-        <w:pStyle w:val="Ttulo1"/>
-      </w:pPr>
-      <w:r>
-        <w:t xml:space="preserve">4. </w:t>
-      </w:r>
-      <w:r>
-        <w:t>C</w:t>
-      </w:r>
-      <w:r>
-        <w:t>ONSULTAS</w:t>
-      </w:r>
-      <w:r>
-        <w:t xml:space="preserve"> INNER JOIN </w:t>
-      </w:r>
-    </w:p>
-    <w:p>
-      <w:pPr>
+        <w:lastRenderedPageBreak/>
+        <w:t>2. OBJETIVO D</w:t>
+      </w:r>
+      <w:r>
+        <w:t>E</w:t>
+      </w:r>
+      <w:r>
+        <w:t xml:space="preserve"> LA ACTIVIDAD</w:t>
+      </w:r>
+    </w:p>
+    <w:p>
+      <w:pPr>
+        <w:pStyle w:val="Ttulo2"/>
+      </w:pPr>
+      <w:r>
+        <w:t>2.1. Objetivo general</w:t>
+      </w:r>
+    </w:p>
+    <w:p>
+      <w:pPr>
+        <w:pStyle w:val="APASEPTIMA"/>
+      </w:pPr>
+      <w:r>
+        <w:t>Aplicar consultas mediante sentencias SQL que permitan dar respuesta a una necesidad o pregunta, para mostrar datos de las emergencias que permitan identificar de una mejor manera y de forma completa los datos y estados de cada emergencia registrada en la institución educativa, comprobando que los datos sean consistentes y que las diferentes tablas funcionen correctamente.</w:t>
+      </w:r>
+    </w:p>
+    <w:p>
+      <w:pPr>
+        <w:pStyle w:val="Ttulo2"/>
+        <w:rPr>
+          <w:u w:val="single"/>
+        </w:rPr>
+      </w:pPr>
+      <w:r>
+        <w:t xml:space="preserve">2.2. Objetivos generales </w:t>
+      </w:r>
+    </w:p>
+    <w:p>
+      <w:pPr>
+        <w:pStyle w:val="APASEPTIMA"/>
         <w:numPr>
           <w:ilvl w:val="0"/>
-          <w:numId w:val="1"/>
+          <w:numId w:val="8"/>
         </w:numPr>
       </w:pPr>
       <w:r>
-        <w:t xml:space="preserve">Consulta 1 </w:t>
-      </w:r>
-    </w:p>
-    <w:p>
-      <w:pPr>
+        <w:t xml:space="preserve">Utilizar sentencias INNER JOIN para consultar datos más completos de emergencias almacenados en distintas tablas, como ubicaciones, tipos de emergencia y institución educativa. </w:t>
+      </w:r>
+    </w:p>
+    <w:p>
+      <w:pPr>
+        <w:pStyle w:val="APASEPTIMA"/>
         <w:numPr>
           <w:ilvl w:val="0"/>
-          <w:numId w:val="1"/>
+          <w:numId w:val="8"/>
         </w:numPr>
       </w:pPr>
       <w:r>
-        <w:t xml:space="preserve">Evidencia de ejecución </w:t>
-      </w:r>
-    </w:p>
-    <w:p>
-      <w:pPr>
+        <w:t>Utilizar funciones de agregación como</w:t>
+      </w:r>
+      <w:r>
+        <w:t xml:space="preserve"> </w:t>
+      </w:r>
+      <w:r>
+        <w:t>COUNT</w:t>
+      </w:r>
+      <w:r>
+        <w:t xml:space="preserve">, </w:t>
+      </w:r>
+      <w:r>
+        <w:t>GROUP BY</w:t>
+      </w:r>
+      <w:r>
+        <w:t xml:space="preserve">, </w:t>
+      </w:r>
+      <w:r>
+        <w:t>para obtener información resumida de la</w:t>
+      </w:r>
+      <w:r>
+        <w:t>s emergencias registradas</w:t>
+      </w:r>
+      <w:r>
+        <w:t>.</w:t>
+      </w:r>
+    </w:p>
+    <w:p>
+      <w:pPr>
+        <w:pStyle w:val="APASEPTIMA"/>
         <w:numPr>
           <w:ilvl w:val="0"/>
-          <w:numId w:val="1"/>
+          <w:numId w:val="8"/>
         </w:numPr>
       </w:pPr>
       <w:r>
-        <w:t xml:space="preserve">Resultado </w:t>
-      </w:r>
-    </w:p>
-    <w:p>
-      <w:pPr>
+        <w:t>Identificar y corregir distintas inconsistencias encontradas en los registros de alertas, estructura de tablas, y validaciones de registro de emergencias.</w:t>
+      </w:r>
+    </w:p>
+    <w:p>
+      <w:pPr>
+        <w:pStyle w:val="APASEPTIMA"/>
         <w:numPr>
           <w:ilvl w:val="0"/>
-          <w:numId w:val="1"/>
+          <w:numId w:val="8"/>
         </w:numPr>
       </w:pPr>
       <w:r>
-        <w:t xml:space="preserve">Explicación </w:t>
-      </w:r>
-    </w:p>
-    <w:p>
-      <w:pPr>
-        <w:numPr>
-          <w:ilvl w:val="0"/>
-          <w:numId w:val="1"/>
-        </w:numPr>
-      </w:pPr>
-      <w:r>
-        <w:t xml:space="preserve">Consulta 2 </w:t>
-      </w:r>
-    </w:p>
-    <w:p>
-      <w:pPr>
-        <w:numPr>
-          <w:ilvl w:val="0"/>
-          <w:numId w:val="1"/>
-        </w:numPr>
-      </w:pPr>
-      <w:r>
-        <w:t xml:space="preserve">Evidencia </w:t>
-      </w:r>
-    </w:p>
-    <w:p>
-      <w:pPr>
-        <w:numPr>
-          <w:ilvl w:val="0"/>
-          <w:numId w:val="1"/>
-        </w:numPr>
-      </w:pPr>
-      <w:r>
-        <w:t xml:space="preserve">Resultado </w:t>
-      </w:r>
-    </w:p>
-    <w:p>
-      <w:pPr>
-        <w:numPr>
-          <w:ilvl w:val="0"/>
-          <w:numId w:val="1"/>
-        </w:numPr>
-      </w:pPr>
-      <w:r>
-        <w:t xml:space="preserve">Explicación </w:t>
-      </w:r>
-    </w:p>
+        <w:t>Registrar el trabajo realizado</w:t>
+      </w:r>
+      <w:r>
+        <w:t xml:space="preserve"> durante esta semana</w:t>
+      </w:r>
+      <w:r>
+        <w:t xml:space="preserve"> mediante </w:t>
+      </w:r>
+      <w:r>
+        <w:t>una</w:t>
+      </w:r>
+      <w:r>
+        <w:t xml:space="preserve"> rama </w:t>
+      </w:r>
+      <w:r>
+        <w:t xml:space="preserve">de trabajo propia </w:t>
+      </w:r>
+      <w:r>
+        <w:t xml:space="preserve">y </w:t>
+      </w:r>
+      <w:r>
+        <w:t>con</w:t>
+      </w:r>
+      <w:r>
+        <w:t xml:space="preserve"> commits </w:t>
+      </w:r>
+      <w:r>
+        <w:t xml:space="preserve">descriptivos </w:t>
+      </w:r>
+      <w:r>
+        <w:t>e</w:t>
+      </w:r>
+      <w:r>
+        <w:t>n</w:t>
+      </w:r>
+      <w:r>
+        <w:t xml:space="preserve"> GitHub.</w:t>
+      </w:r>
+    </w:p>
+    <w:p/>
+    <w:p/>
+    <w:p/>
+    <w:p/>
+    <w:p/>
+    <w:p/>
+    <w:p/>
     <w:p>
       <w:pPr>
         <w:pStyle w:val="Ttulo1"/>
       </w:pPr>
       <w:r>
+        <w:lastRenderedPageBreak/>
+        <w:t>2. DATOS DEL ESTUDIANTE Y ROL</w:t>
+      </w:r>
+    </w:p>
+    <w:p>
+      <w:pPr>
+        <w:pStyle w:val="APASEPTIMA"/>
+        <w:rPr>
+          <w:u w:val="single"/>
+        </w:rPr>
+      </w:pPr>
+      <w:r>
+        <w:t>Con el propósito de trabajar de forma colorativa para el diseño y estructura de la base de datos que se utilizara para el proyecto SafeSchool Alert, como parte de los integrantes del equipo se me asignaron los cargos de gestionar y supervisar la tabla alerto, que almacena los registros de cada una de las emergencias reportadas y detectas dentro de la institución educativa.</w:t>
+      </w:r>
+    </w:p>
+    <w:p>
+      <w:pPr>
+        <w:pStyle w:val="APASEPTIMA"/>
+        <w:rPr>
+          <w:u w:val="single"/>
+        </w:rPr>
+      </w:pPr>
+      <w:r>
+        <w:t>P</w:t>
+      </w:r>
+      <w:r>
+        <w:t>ara ello en esta sección se presenta los datos principales que se me asignaron trabajar en la base de datos del proyecto, durante esta actividad práctica de la semana número 3:</w:t>
+      </w:r>
+    </w:p>
+    <w:tbl>
+      <w:tblPr>
+        <w:tblStyle w:val="Tablanormal1"/>
+        <w:tblW w:w="5000" w:type="pct"/>
+        <w:tblCellMar>
+          <w:top w:w="113" w:type="dxa"/>
+          <w:bottom w:w="113" w:type="dxa"/>
+        </w:tblCellMar>
+        <w:tblLook w:val="04A0" w:firstRow="1" w:lastRow="0" w:firstColumn="1" w:lastColumn="0" w:noHBand="0" w:noVBand="1"/>
+      </w:tblPr>
+      <w:tblGrid>
+        <w:gridCol w:w="563"/>
+        <w:gridCol w:w="2753"/>
+        <w:gridCol w:w="6034"/>
+      </w:tblGrid>
+      <w:tr>
+        <w:trPr>
+          <w:cnfStyle w:val="100000000000" w:firstRow="1" w:lastRow="0" w:firstColumn="0" w:lastColumn="0" w:oddVBand="0" w:evenVBand="0" w:oddHBand="0" w:evenHBand="0" w:firstRowFirstColumn="0" w:firstRowLastColumn="0" w:lastRowFirstColumn="0" w:lastRowLastColumn="0"/>
+        </w:trPr>
+        <w:tc>
+          <w:tcPr>
+            <w:cnfStyle w:val="001000000000" w:firstRow="0" w:lastRow="0" w:firstColumn="1" w:lastColumn="0" w:oddVBand="0" w:evenVBand="0" w:oddHBand="0" w:evenHBand="0" w:firstRowFirstColumn="0" w:firstRowLastColumn="0" w:lastRowFirstColumn="0" w:lastRowLastColumn="0"/>
+            <w:tcW w:w="301" w:type="pct"/>
+            <w:shd w:val="clear" w:color="auto" w:fill="1B5285"/>
+          </w:tcPr>
+          <w:p>
+            <w:pPr>
+              <w:rPr>
+                <w:rFonts w:ascii="Arial" w:hAnsi="Arial" w:cs="Arial"/>
+                <w:color w:val="F2F2F2" w:themeColor="background1" w:themeShade="F2"/>
+                <w:sz w:val="22"/>
+                <w:szCs w:val="22"/>
+              </w:rPr>
+            </w:pPr>
+            <w:r>
+              <w:rPr>
+                <w:rFonts w:ascii="Arial" w:hAnsi="Arial" w:cs="Arial"/>
+                <w:color w:val="F2F2F2" w:themeColor="background1" w:themeShade="F2"/>
+                <w:sz w:val="22"/>
+                <w:szCs w:val="22"/>
+              </w:rPr>
+              <w:t>N°</w:t>
+            </w:r>
+          </w:p>
+        </w:tc>
+        <w:tc>
+          <w:tcPr>
+            <w:tcW w:w="1472" w:type="pct"/>
+            <w:shd w:val="clear" w:color="auto" w:fill="1B5285"/>
+            <w:hideMark/>
+          </w:tcPr>
+          <w:p>
+            <w:pPr>
+              <w:cnfStyle w:val="100000000000" w:firstRow="1" w:lastRow="0" w:firstColumn="0" w:lastColumn="0" w:oddVBand="0" w:evenVBand="0" w:oddHBand="0" w:evenHBand="0" w:firstRowFirstColumn="0" w:firstRowLastColumn="0" w:lastRowFirstColumn="0" w:lastRowLastColumn="0"/>
+              <w:rPr>
+                <w:rFonts w:ascii="Arial" w:hAnsi="Arial" w:cs="Arial"/>
+                <w:color w:val="F2F2F2" w:themeColor="background1" w:themeShade="F2"/>
+                <w:sz w:val="22"/>
+                <w:szCs w:val="22"/>
+              </w:rPr>
+            </w:pPr>
+            <w:r>
+              <w:rPr>
+                <w:rFonts w:ascii="Arial" w:hAnsi="Arial" w:cs="Arial"/>
+                <w:color w:val="F2F2F2" w:themeColor="background1" w:themeShade="F2"/>
+                <w:sz w:val="22"/>
+                <w:szCs w:val="22"/>
+              </w:rPr>
+              <w:t>Dato</w:t>
+            </w:r>
+          </w:p>
+        </w:tc>
+        <w:tc>
+          <w:tcPr>
+            <w:tcW w:w="3228" w:type="pct"/>
+            <w:shd w:val="clear" w:color="auto" w:fill="1B5285"/>
+            <w:hideMark/>
+          </w:tcPr>
+          <w:p>
+            <w:pPr>
+              <w:cnfStyle w:val="100000000000" w:firstRow="1" w:lastRow="0" w:firstColumn="0" w:lastColumn="0" w:oddVBand="0" w:evenVBand="0" w:oddHBand="0" w:evenHBand="0" w:firstRowFirstColumn="0" w:firstRowLastColumn="0" w:lastRowFirstColumn="0" w:lastRowLastColumn="0"/>
+              <w:rPr>
+                <w:rFonts w:ascii="Arial" w:hAnsi="Arial" w:cs="Arial"/>
+                <w:color w:val="F2F2F2" w:themeColor="background1" w:themeShade="F2"/>
+                <w:sz w:val="22"/>
+                <w:szCs w:val="22"/>
+                <w:u w:val="single"/>
+              </w:rPr>
+            </w:pPr>
+            <w:r>
+              <w:rPr>
+                <w:rFonts w:ascii="Arial" w:hAnsi="Arial" w:cs="Arial"/>
+                <w:color w:val="F2F2F2" w:themeColor="background1" w:themeShade="F2"/>
+                <w:sz w:val="22"/>
+                <w:szCs w:val="22"/>
+              </w:rPr>
+              <w:t>Información</w:t>
+            </w:r>
+          </w:p>
+        </w:tc>
+      </w:tr>
+      <w:tr>
+        <w:trPr>
+          <w:cnfStyle w:val="000000100000" w:firstRow="0" w:lastRow="0" w:firstColumn="0" w:lastColumn="0" w:oddVBand="0" w:evenVBand="0" w:oddHBand="1" w:evenHBand="0" w:firstRowFirstColumn="0" w:firstRowLastColumn="0" w:lastRowFirstColumn="0" w:lastRowLastColumn="0"/>
+        </w:trPr>
+        <w:tc>
+          <w:tcPr>
+            <w:cnfStyle w:val="001000000000" w:firstRow="0" w:lastRow="0" w:firstColumn="1" w:lastColumn="0" w:oddVBand="0" w:evenVBand="0" w:oddHBand="0" w:evenHBand="0" w:firstRowFirstColumn="0" w:firstRowLastColumn="0" w:lastRowFirstColumn="0" w:lastRowLastColumn="0"/>
+            <w:tcW w:w="301" w:type="pct"/>
+          </w:tcPr>
+          <w:p>
+            <w:pPr>
+              <w:rPr>
+                <w:rFonts w:ascii="Arial" w:hAnsi="Arial" w:cs="Arial"/>
+                <w:sz w:val="22"/>
+                <w:szCs w:val="22"/>
+              </w:rPr>
+            </w:pPr>
+            <w:r>
+              <w:rPr>
+                <w:rFonts w:ascii="Arial" w:hAnsi="Arial" w:cs="Arial"/>
+                <w:sz w:val="22"/>
+                <w:szCs w:val="22"/>
+              </w:rPr>
+              <w:t>1</w:t>
+            </w:r>
+          </w:p>
+        </w:tc>
+        <w:tc>
+          <w:tcPr>
+            <w:tcW w:w="1472" w:type="pct"/>
+            <w:hideMark/>
+          </w:tcPr>
+          <w:p>
+            <w:pPr>
+              <w:cnfStyle w:val="000000100000" w:firstRow="0" w:lastRow="0" w:firstColumn="0" w:lastColumn="0" w:oddVBand="0" w:evenVBand="0" w:oddHBand="1" w:evenHBand="0" w:firstRowFirstColumn="0" w:firstRowLastColumn="0" w:lastRowFirstColumn="0" w:lastRowLastColumn="0"/>
+              <w:rPr>
+                <w:rFonts w:ascii="Arial" w:hAnsi="Arial" w:cs="Arial"/>
+                <w:sz w:val="22"/>
+                <w:szCs w:val="22"/>
+              </w:rPr>
+            </w:pPr>
+            <w:r>
+              <w:rPr>
+                <w:rFonts w:ascii="Arial" w:hAnsi="Arial" w:cs="Arial"/>
+                <w:sz w:val="22"/>
+                <w:szCs w:val="22"/>
+              </w:rPr>
+              <w:t>Proyecto</w:t>
+            </w:r>
+          </w:p>
+        </w:tc>
+        <w:tc>
+          <w:tcPr>
+            <w:tcW w:w="3228" w:type="pct"/>
+            <w:hideMark/>
+          </w:tcPr>
+          <w:p>
+            <w:pPr>
+              <w:cnfStyle w:val="000000100000" w:firstRow="0" w:lastRow="0" w:firstColumn="0" w:lastColumn="0" w:oddVBand="0" w:evenVBand="0" w:oddHBand="1" w:evenHBand="0" w:firstRowFirstColumn="0" w:firstRowLastColumn="0" w:lastRowFirstColumn="0" w:lastRowLastColumn="0"/>
+              <w:rPr>
+                <w:rFonts w:ascii="Arial" w:hAnsi="Arial" w:cs="Arial"/>
+                <w:sz w:val="22"/>
+                <w:szCs w:val="22"/>
+              </w:rPr>
+            </w:pPr>
+            <w:r>
+              <w:rPr>
+                <w:rFonts w:ascii="Arial" w:hAnsi="Arial" w:cs="Arial"/>
+                <w:sz w:val="22"/>
+                <w:szCs w:val="22"/>
+              </w:rPr>
+              <w:t>SafeSchool Alert</w:t>
+            </w:r>
+          </w:p>
+        </w:tc>
+      </w:tr>
+      <w:tr>
+        <w:tc>
+          <w:tcPr>
+            <w:cnfStyle w:val="001000000000" w:firstRow="0" w:lastRow="0" w:firstColumn="1" w:lastColumn="0" w:oddVBand="0" w:evenVBand="0" w:oddHBand="0" w:evenHBand="0" w:firstRowFirstColumn="0" w:firstRowLastColumn="0" w:lastRowFirstColumn="0" w:lastRowLastColumn="0"/>
+            <w:tcW w:w="301" w:type="pct"/>
+          </w:tcPr>
+          <w:p>
+            <w:pPr>
+              <w:rPr>
+                <w:rFonts w:ascii="Arial" w:hAnsi="Arial" w:cs="Arial"/>
+                <w:sz w:val="22"/>
+                <w:szCs w:val="22"/>
+              </w:rPr>
+            </w:pPr>
+            <w:r>
+              <w:rPr>
+                <w:rFonts w:ascii="Arial" w:hAnsi="Arial" w:cs="Arial"/>
+                <w:sz w:val="22"/>
+                <w:szCs w:val="22"/>
+              </w:rPr>
+              <w:t>2</w:t>
+            </w:r>
+          </w:p>
+        </w:tc>
+        <w:tc>
+          <w:tcPr>
+            <w:tcW w:w="1472" w:type="pct"/>
+            <w:hideMark/>
+          </w:tcPr>
+          <w:p>
+            <w:pPr>
+              <w:cnfStyle w:val="000000000000" w:firstRow="0" w:lastRow="0" w:firstColumn="0" w:lastColumn="0" w:oddVBand="0" w:evenVBand="0" w:oddHBand="0" w:evenHBand="0" w:firstRowFirstColumn="0" w:firstRowLastColumn="0" w:lastRowFirstColumn="0" w:lastRowLastColumn="0"/>
+              <w:rPr>
+                <w:rFonts w:ascii="Arial" w:hAnsi="Arial" w:cs="Arial"/>
+                <w:sz w:val="22"/>
+                <w:szCs w:val="22"/>
+              </w:rPr>
+            </w:pPr>
+            <w:r>
+              <w:rPr>
+                <w:rFonts w:ascii="Arial" w:hAnsi="Arial" w:cs="Arial"/>
+                <w:sz w:val="22"/>
+                <w:szCs w:val="22"/>
+              </w:rPr>
+              <w:t>Estudiante</w:t>
+            </w:r>
+          </w:p>
+        </w:tc>
+        <w:tc>
+          <w:tcPr>
+            <w:tcW w:w="3228" w:type="pct"/>
+            <w:hideMark/>
+          </w:tcPr>
+          <w:p>
+            <w:pPr>
+              <w:cnfStyle w:val="000000000000" w:firstRow="0" w:lastRow="0" w:firstColumn="0" w:lastColumn="0" w:oddVBand="0" w:evenVBand="0" w:oddHBand="0" w:evenHBand="0" w:firstRowFirstColumn="0" w:firstRowLastColumn="0" w:lastRowFirstColumn="0" w:lastRowLastColumn="0"/>
+              <w:rPr>
+                <w:rFonts w:ascii="Arial" w:hAnsi="Arial" w:cs="Arial"/>
+                <w:sz w:val="22"/>
+                <w:szCs w:val="22"/>
+                <w:u w:val="single"/>
+              </w:rPr>
+            </w:pPr>
+            <w:r>
+              <w:rPr>
+                <w:rFonts w:ascii="Arial" w:hAnsi="Arial" w:cs="Arial"/>
+                <w:sz w:val="22"/>
+                <w:szCs w:val="22"/>
+              </w:rPr>
+              <w:t>José Rolando Velasco Peña</w:t>
+            </w:r>
+          </w:p>
+        </w:tc>
+      </w:tr>
+      <w:tr>
+        <w:trPr>
+          <w:cnfStyle w:val="000000100000" w:firstRow="0" w:lastRow="0" w:firstColumn="0" w:lastColumn="0" w:oddVBand="0" w:evenVBand="0" w:oddHBand="1" w:evenHBand="0" w:firstRowFirstColumn="0" w:firstRowLastColumn="0" w:lastRowFirstColumn="0" w:lastRowLastColumn="0"/>
+        </w:trPr>
+        <w:tc>
+          <w:tcPr>
+            <w:cnfStyle w:val="001000000000" w:firstRow="0" w:lastRow="0" w:firstColumn="1" w:lastColumn="0" w:oddVBand="0" w:evenVBand="0" w:oddHBand="0" w:evenHBand="0" w:firstRowFirstColumn="0" w:firstRowLastColumn="0" w:lastRowFirstColumn="0" w:lastRowLastColumn="0"/>
+            <w:tcW w:w="301" w:type="pct"/>
+          </w:tcPr>
+          <w:p>
+            <w:pPr>
+              <w:rPr>
+                <w:rFonts w:ascii="Arial" w:hAnsi="Arial" w:cs="Arial"/>
+                <w:sz w:val="22"/>
+                <w:szCs w:val="22"/>
+              </w:rPr>
+            </w:pPr>
+            <w:r>
+              <w:rPr>
+                <w:rFonts w:ascii="Arial" w:hAnsi="Arial" w:cs="Arial"/>
+                <w:sz w:val="22"/>
+                <w:szCs w:val="22"/>
+              </w:rPr>
+              <w:t>3</w:t>
+            </w:r>
+          </w:p>
+        </w:tc>
+        <w:tc>
+          <w:tcPr>
+            <w:tcW w:w="1472" w:type="pct"/>
+            <w:hideMark/>
+          </w:tcPr>
+          <w:p>
+            <w:pPr>
+              <w:cnfStyle w:val="000000100000" w:firstRow="0" w:lastRow="0" w:firstColumn="0" w:lastColumn="0" w:oddVBand="0" w:evenVBand="0" w:oddHBand="1" w:evenHBand="0" w:firstRowFirstColumn="0" w:firstRowLastColumn="0" w:lastRowFirstColumn="0" w:lastRowLastColumn="0"/>
+              <w:rPr>
+                <w:rFonts w:ascii="Arial" w:hAnsi="Arial" w:cs="Arial"/>
+                <w:sz w:val="22"/>
+                <w:szCs w:val="22"/>
+              </w:rPr>
+            </w:pPr>
+            <w:r>
+              <w:rPr>
+                <w:rFonts w:ascii="Arial" w:hAnsi="Arial" w:cs="Arial"/>
+                <w:sz w:val="22"/>
+                <w:szCs w:val="22"/>
+              </w:rPr>
+              <w:t>Módulo</w:t>
+            </w:r>
+          </w:p>
+        </w:tc>
+        <w:tc>
+          <w:tcPr>
+            <w:tcW w:w="3228" w:type="pct"/>
+            <w:hideMark/>
+          </w:tcPr>
+          <w:p>
+            <w:pPr>
+              <w:cnfStyle w:val="000000100000" w:firstRow="0" w:lastRow="0" w:firstColumn="0" w:lastColumn="0" w:oddVBand="0" w:evenVBand="0" w:oddHBand="1" w:evenHBand="0" w:firstRowFirstColumn="0" w:firstRowLastColumn="0" w:lastRowFirstColumn="0" w:lastRowLastColumn="0"/>
+              <w:rPr>
+                <w:rFonts w:ascii="Arial" w:hAnsi="Arial" w:cs="Arial"/>
+                <w:sz w:val="22"/>
+                <w:szCs w:val="22"/>
+              </w:rPr>
+            </w:pPr>
+            <w:r>
+              <w:rPr>
+                <w:rFonts w:ascii="Arial" w:hAnsi="Arial" w:cs="Arial"/>
+                <w:sz w:val="22"/>
+                <w:szCs w:val="22"/>
+              </w:rPr>
+              <w:t>BTVDS 3.3 Administración de Bases de Datos</w:t>
+            </w:r>
+          </w:p>
+        </w:tc>
+      </w:tr>
+      <w:tr>
+        <w:tc>
+          <w:tcPr>
+            <w:cnfStyle w:val="001000000000" w:firstRow="0" w:lastRow="0" w:firstColumn="1" w:lastColumn="0" w:oddVBand="0" w:evenVBand="0" w:oddHBand="0" w:evenHBand="0" w:firstRowFirstColumn="0" w:firstRowLastColumn="0" w:lastRowFirstColumn="0" w:lastRowLastColumn="0"/>
+            <w:tcW w:w="301" w:type="pct"/>
+          </w:tcPr>
+          <w:p>
+            <w:pPr>
+              <w:rPr>
+                <w:rFonts w:ascii="Arial" w:hAnsi="Arial" w:cs="Arial"/>
+                <w:sz w:val="22"/>
+                <w:szCs w:val="22"/>
+              </w:rPr>
+            </w:pPr>
+            <w:r>
+              <w:rPr>
+                <w:rFonts w:ascii="Arial" w:hAnsi="Arial" w:cs="Arial"/>
+                <w:sz w:val="22"/>
+                <w:szCs w:val="22"/>
+              </w:rPr>
+              <w:t>4</w:t>
+            </w:r>
+          </w:p>
+        </w:tc>
+        <w:tc>
+          <w:tcPr>
+            <w:tcW w:w="1472" w:type="pct"/>
+            <w:hideMark/>
+          </w:tcPr>
+          <w:p>
+            <w:pPr>
+              <w:cnfStyle w:val="000000000000" w:firstRow="0" w:lastRow="0" w:firstColumn="0" w:lastColumn="0" w:oddVBand="0" w:evenVBand="0" w:oddHBand="0" w:evenHBand="0" w:firstRowFirstColumn="0" w:firstRowLastColumn="0" w:lastRowFirstColumn="0" w:lastRowLastColumn="0"/>
+              <w:rPr>
+                <w:rFonts w:ascii="Arial" w:hAnsi="Arial" w:cs="Arial"/>
+                <w:sz w:val="22"/>
+                <w:szCs w:val="22"/>
+              </w:rPr>
+            </w:pPr>
+            <w:r>
+              <w:rPr>
+                <w:rFonts w:ascii="Arial" w:hAnsi="Arial" w:cs="Arial"/>
+                <w:sz w:val="22"/>
+                <w:szCs w:val="22"/>
+              </w:rPr>
+              <w:t>Semana</w:t>
+            </w:r>
+          </w:p>
+        </w:tc>
+        <w:tc>
+          <w:tcPr>
+            <w:tcW w:w="3228" w:type="pct"/>
+            <w:hideMark/>
+          </w:tcPr>
+          <w:p>
+            <w:pPr>
+              <w:cnfStyle w:val="000000000000" w:firstRow="0" w:lastRow="0" w:firstColumn="0" w:lastColumn="0" w:oddVBand="0" w:evenVBand="0" w:oddHBand="0" w:evenHBand="0" w:firstRowFirstColumn="0" w:firstRowLastColumn="0" w:lastRowFirstColumn="0" w:lastRowLastColumn="0"/>
+              <w:rPr>
+                <w:rFonts w:ascii="Arial" w:hAnsi="Arial" w:cs="Arial"/>
+                <w:sz w:val="22"/>
+                <w:szCs w:val="22"/>
+                <w:u w:val="single"/>
+              </w:rPr>
+            </w:pPr>
+            <w:r>
+              <w:rPr>
+                <w:rFonts w:ascii="Arial" w:hAnsi="Arial" w:cs="Arial"/>
+                <w:sz w:val="22"/>
+                <w:szCs w:val="22"/>
+              </w:rPr>
+              <w:t>3</w:t>
+            </w:r>
+            <w:r>
+              <w:rPr>
+                <w:rFonts w:ascii="Arial" w:hAnsi="Arial" w:cs="Arial"/>
+                <w:sz w:val="22"/>
+                <w:szCs w:val="22"/>
+              </w:rPr>
+              <w:t xml:space="preserve"> consultas </w:t>
+            </w:r>
+            <w:r>
+              <w:rPr>
+                <w:rFonts w:ascii="Arial" w:hAnsi="Arial" w:cs="Arial"/>
+                <w:sz w:val="22"/>
+                <w:szCs w:val="22"/>
+                <w:u w:val="single"/>
+              </w:rPr>
+              <w:t>avanzadas</w:t>
+            </w:r>
+          </w:p>
+        </w:tc>
+      </w:tr>
+      <w:tr>
+        <w:trPr>
+          <w:cnfStyle w:val="000000100000" w:firstRow="0" w:lastRow="0" w:firstColumn="0" w:lastColumn="0" w:oddVBand="0" w:evenVBand="0" w:oddHBand="1" w:evenHBand="0" w:firstRowFirstColumn="0" w:firstRowLastColumn="0" w:lastRowFirstColumn="0" w:lastRowLastColumn="0"/>
+        </w:trPr>
+        <w:tc>
+          <w:tcPr>
+            <w:cnfStyle w:val="001000000000" w:firstRow="0" w:lastRow="0" w:firstColumn="1" w:lastColumn="0" w:oddVBand="0" w:evenVBand="0" w:oddHBand="0" w:evenHBand="0" w:firstRowFirstColumn="0" w:firstRowLastColumn="0" w:lastRowFirstColumn="0" w:lastRowLastColumn="0"/>
+            <w:tcW w:w="301" w:type="pct"/>
+          </w:tcPr>
+          <w:p>
+            <w:pPr>
+              <w:rPr>
+                <w:rFonts w:ascii="Arial" w:hAnsi="Arial" w:cs="Arial"/>
+                <w:sz w:val="22"/>
+                <w:szCs w:val="22"/>
+              </w:rPr>
+            </w:pPr>
+            <w:r>
+              <w:rPr>
+                <w:rFonts w:ascii="Arial" w:hAnsi="Arial" w:cs="Arial"/>
+                <w:sz w:val="22"/>
+                <w:szCs w:val="22"/>
+              </w:rPr>
+              <w:t>5</w:t>
+            </w:r>
+          </w:p>
+        </w:tc>
+        <w:tc>
+          <w:tcPr>
+            <w:tcW w:w="1472" w:type="pct"/>
+            <w:hideMark/>
+          </w:tcPr>
+          <w:p>
+            <w:pPr>
+              <w:cnfStyle w:val="000000100000" w:firstRow="0" w:lastRow="0" w:firstColumn="0" w:lastColumn="0" w:oddVBand="0" w:evenVBand="0" w:oddHBand="1" w:evenHBand="0" w:firstRowFirstColumn="0" w:firstRowLastColumn="0" w:lastRowFirstColumn="0" w:lastRowLastColumn="0"/>
+              <w:rPr>
+                <w:rFonts w:ascii="Arial" w:hAnsi="Arial" w:cs="Arial"/>
+                <w:sz w:val="22"/>
+                <w:szCs w:val="22"/>
+              </w:rPr>
+            </w:pPr>
+            <w:r>
+              <w:rPr>
+                <w:rFonts w:ascii="Arial" w:hAnsi="Arial" w:cs="Arial"/>
+                <w:sz w:val="22"/>
+                <w:szCs w:val="22"/>
+              </w:rPr>
+              <w:t>Rol</w:t>
+            </w:r>
+          </w:p>
+        </w:tc>
+        <w:tc>
+          <w:tcPr>
+            <w:tcW w:w="3228" w:type="pct"/>
+            <w:hideMark/>
+          </w:tcPr>
+          <w:p>
+            <w:pPr>
+              <w:cnfStyle w:val="000000100000" w:firstRow="0" w:lastRow="0" w:firstColumn="0" w:lastColumn="0" w:oddVBand="0" w:evenVBand="0" w:oddHBand="1" w:evenHBand="0" w:firstRowFirstColumn="0" w:firstRowLastColumn="0" w:lastRowFirstColumn="0" w:lastRowLastColumn="0"/>
+              <w:rPr>
+                <w:rFonts w:ascii="Arial" w:hAnsi="Arial" w:cs="Arial"/>
+                <w:sz w:val="22"/>
+                <w:szCs w:val="22"/>
+              </w:rPr>
+            </w:pPr>
+            <w:r>
+              <w:rPr>
+                <w:rFonts w:ascii="Arial" w:hAnsi="Arial" w:cs="Arial"/>
+                <w:sz w:val="22"/>
+                <w:szCs w:val="22"/>
+              </w:rPr>
+              <w:t>Consultas</w:t>
+            </w:r>
+            <w:r>
+              <w:rPr>
+                <w:rFonts w:ascii="Arial" w:hAnsi="Arial" w:cs="Arial"/>
+                <w:sz w:val="22"/>
+                <w:szCs w:val="22"/>
+              </w:rPr>
+              <w:t>, verificación de inconsistencias en la tabla “</w:t>
+            </w:r>
+            <w:r>
+              <w:rPr>
+                <w:rFonts w:ascii="Arial" w:hAnsi="Arial" w:cs="Arial"/>
+                <w:sz w:val="22"/>
+                <w:szCs w:val="22"/>
+                <w:u w:val="single"/>
+              </w:rPr>
+              <w:t>alertas</w:t>
+            </w:r>
+            <w:r>
+              <w:rPr>
+                <w:rFonts w:ascii="Arial" w:hAnsi="Arial" w:cs="Arial"/>
+                <w:sz w:val="22"/>
+                <w:szCs w:val="22"/>
+              </w:rPr>
+              <w:t>”</w:t>
+            </w:r>
+          </w:p>
+        </w:tc>
+      </w:tr>
+      <w:tr>
+        <w:trPr>
+          <w:trHeight w:val="22"/>
+        </w:trPr>
+        <w:tc>
+          <w:tcPr>
+            <w:cnfStyle w:val="001000000000" w:firstRow="0" w:lastRow="0" w:firstColumn="1" w:lastColumn="0" w:oddVBand="0" w:evenVBand="0" w:oddHBand="0" w:evenHBand="0" w:firstRowFirstColumn="0" w:firstRowLastColumn="0" w:lastRowFirstColumn="0" w:lastRowLastColumn="0"/>
+            <w:tcW w:w="301" w:type="pct"/>
+          </w:tcPr>
+          <w:p>
+            <w:pPr>
+              <w:rPr>
+                <w:rFonts w:ascii="Arial" w:hAnsi="Arial" w:cs="Arial"/>
+                <w:sz w:val="22"/>
+                <w:szCs w:val="22"/>
+              </w:rPr>
+            </w:pPr>
+            <w:r>
+              <w:rPr>
+                <w:rFonts w:ascii="Arial" w:hAnsi="Arial" w:cs="Arial"/>
+                <w:sz w:val="22"/>
+                <w:szCs w:val="22"/>
+              </w:rPr>
+              <w:t>6</w:t>
+            </w:r>
+          </w:p>
+        </w:tc>
+        <w:tc>
+          <w:tcPr>
+            <w:tcW w:w="1472" w:type="pct"/>
+            <w:hideMark/>
+          </w:tcPr>
+          <w:p>
+            <w:pPr>
+              <w:cnfStyle w:val="000000000000" w:firstRow="0" w:lastRow="0" w:firstColumn="0" w:lastColumn="0" w:oddVBand="0" w:evenVBand="0" w:oddHBand="0" w:evenHBand="0" w:firstRowFirstColumn="0" w:firstRowLastColumn="0" w:lastRowFirstColumn="0" w:lastRowLastColumn="0"/>
+              <w:rPr>
+                <w:rFonts w:ascii="Arial" w:hAnsi="Arial" w:cs="Arial"/>
+                <w:sz w:val="22"/>
+                <w:szCs w:val="22"/>
+                <w:u w:val="single"/>
+              </w:rPr>
+            </w:pPr>
+            <w:r>
+              <w:rPr>
+                <w:rFonts w:ascii="Arial" w:hAnsi="Arial" w:cs="Arial"/>
+                <w:sz w:val="22"/>
+                <w:szCs w:val="22"/>
+              </w:rPr>
+              <w:t>Rama</w:t>
+            </w:r>
+            <w:r>
+              <w:rPr>
+                <w:rFonts w:ascii="Arial" w:hAnsi="Arial" w:cs="Arial"/>
+                <w:sz w:val="22"/>
+                <w:szCs w:val="22"/>
+              </w:rPr>
+              <w:t xml:space="preserve"> de trabajo</w:t>
+            </w:r>
+          </w:p>
+        </w:tc>
+        <w:tc>
+          <w:tcPr>
+            <w:tcW w:w="3228" w:type="pct"/>
+            <w:hideMark/>
+          </w:tcPr>
+          <w:p>
+            <w:pPr>
+              <w:cnfStyle w:val="000000000000" w:firstRow="0" w:lastRow="0" w:firstColumn="0" w:lastColumn="0" w:oddVBand="0" w:evenVBand="0" w:oddHBand="0" w:evenHBand="0" w:firstRowFirstColumn="0" w:firstRowLastColumn="0" w:lastRowFirstColumn="0" w:lastRowLastColumn="0"/>
+              <w:rPr>
+                <w:rFonts w:ascii="Arial" w:hAnsi="Arial" w:cs="Arial"/>
+                <w:sz w:val="22"/>
+                <w:szCs w:val="22"/>
+              </w:rPr>
+            </w:pPr>
+            <w:r>
+              <w:rPr>
+                <w:rFonts w:ascii="Arial" w:hAnsi="Arial" w:cs="Arial"/>
+                <w:sz w:val="22"/>
+                <w:szCs w:val="22"/>
+              </w:rPr>
+              <w:t>Rolando_SafeSchool_DB</w:t>
+            </w:r>
+          </w:p>
+        </w:tc>
+      </w:tr>
+      <w:tr>
+        <w:trPr>
+          <w:cnfStyle w:val="000000100000" w:firstRow="0" w:lastRow="0" w:firstColumn="0" w:lastColumn="0" w:oddVBand="0" w:evenVBand="0" w:oddHBand="1" w:evenHBand="0" w:firstRowFirstColumn="0" w:firstRowLastColumn="0" w:lastRowFirstColumn="0" w:lastRowLastColumn="0"/>
+        </w:trPr>
+        <w:tc>
+          <w:tcPr>
+            <w:cnfStyle w:val="001000000000" w:firstRow="0" w:lastRow="0" w:firstColumn="1" w:lastColumn="0" w:oddVBand="0" w:evenVBand="0" w:oddHBand="0" w:evenHBand="0" w:firstRowFirstColumn="0" w:firstRowLastColumn="0" w:lastRowFirstColumn="0" w:lastRowLastColumn="0"/>
+            <w:tcW w:w="301" w:type="pct"/>
+          </w:tcPr>
+          <w:p>
+            <w:pPr>
+              <w:rPr>
+                <w:rFonts w:ascii="Arial" w:hAnsi="Arial" w:cs="Arial"/>
+                <w:sz w:val="22"/>
+                <w:szCs w:val="22"/>
+              </w:rPr>
+            </w:pPr>
+            <w:r>
+              <w:rPr>
+                <w:rFonts w:ascii="Arial" w:hAnsi="Arial" w:cs="Arial"/>
+                <w:sz w:val="22"/>
+                <w:szCs w:val="22"/>
+              </w:rPr>
+              <w:t>7</w:t>
+            </w:r>
+          </w:p>
+        </w:tc>
+        <w:tc>
+          <w:tcPr>
+            <w:tcW w:w="1472" w:type="pct"/>
+          </w:tcPr>
+          <w:p>
+            <w:pPr>
+              <w:cnfStyle w:val="000000100000" w:firstRow="0" w:lastRow="0" w:firstColumn="0" w:lastColumn="0" w:oddVBand="0" w:evenVBand="0" w:oddHBand="1" w:evenHBand="0" w:firstRowFirstColumn="0" w:firstRowLastColumn="0" w:lastRowFirstColumn="0" w:lastRowLastColumn="0"/>
+              <w:rPr>
+                <w:rFonts w:ascii="Arial" w:hAnsi="Arial" w:cs="Arial"/>
+                <w:sz w:val="22"/>
+                <w:szCs w:val="22"/>
+                <w:u w:val="single"/>
+              </w:rPr>
+            </w:pPr>
+            <w:r>
+              <w:rPr>
+                <w:rFonts w:ascii="Arial" w:hAnsi="Arial" w:cs="Arial"/>
+                <w:sz w:val="22"/>
+                <w:szCs w:val="22"/>
+              </w:rPr>
+              <w:t>Repositorio de la BD</w:t>
+            </w:r>
+          </w:p>
+        </w:tc>
+        <w:tc>
+          <w:tcPr>
+            <w:tcW w:w="3228" w:type="pct"/>
+          </w:tcPr>
+          <w:p>
+            <w:pPr>
+              <w:cnfStyle w:val="000000100000" w:firstRow="0" w:lastRow="0" w:firstColumn="0" w:lastColumn="0" w:oddVBand="0" w:evenVBand="0" w:oddHBand="1" w:evenHBand="0" w:firstRowFirstColumn="0" w:firstRowLastColumn="0" w:lastRowFirstColumn="0" w:lastRowLastColumn="0"/>
+              <w:rPr>
+                <w:rFonts w:ascii="Arial" w:hAnsi="Arial" w:cs="Arial"/>
+                <w:sz w:val="22"/>
+                <w:szCs w:val="22"/>
+                <w:u w:val="single"/>
+              </w:rPr>
+            </w:pPr>
+            <w:hyperlink r:id="rId9" w:history="1">
+              <w:r>
+                <w:rPr>
+                  <w:rStyle w:val="Hipervnculo"/>
+                  <w:rFonts w:ascii="Arial" w:hAnsi="Arial" w:cs="Arial"/>
+                  <w:sz w:val="22"/>
+                  <w:szCs w:val="22"/>
+                </w:rPr>
+                <w:t>https://github.com/joserolandovelascopena-code/SafeSchool-Alert-BD</w:t>
+              </w:r>
+            </w:hyperlink>
+            <w:r>
+              <w:rPr>
+                <w:rFonts w:ascii="Arial" w:hAnsi="Arial" w:cs="Arial"/>
+                <w:sz w:val="22"/>
+                <w:szCs w:val="22"/>
+              </w:rPr>
+              <w:t xml:space="preserve"> </w:t>
+            </w:r>
+          </w:p>
+        </w:tc>
+      </w:tr>
+    </w:tbl>
+    <w:p>
+      <w:pPr>
+        <w:rPr>
+          <w:u w:val="single"/>
+        </w:rPr>
+      </w:pPr>
+    </w:p>
+    <w:p>
+      <w:pPr>
+        <w:tabs>
+          <w:tab w:val="left" w:pos="6023"/>
+        </w:tabs>
+        <w:rPr>
+          <w:u w:val="single"/>
+        </w:rPr>
+      </w:pPr>
+      <w:r>
+        <w:tab/>
+      </w:r>
+    </w:p>
+    <w:p/>
+    <w:p/>
+    <w:p/>
+    <w:p/>
+    <w:p/>
+    <w:p/>
+    <w:p>
+      <w:pPr>
+        <w:rPr>
+          <w:u w:val="single"/>
+        </w:rPr>
+      </w:pPr>
+    </w:p>
+    <w:p>
+      <w:pPr>
+        <w:pStyle w:val="Ttulo1"/>
+      </w:pPr>
+      <w:r>
+        <w:lastRenderedPageBreak/>
+        <w:t xml:space="preserve">4. </w:t>
+      </w:r>
+      <w:r>
+        <w:t>C</w:t>
+      </w:r>
+      <w:r>
+        <w:t>ONSULTAS</w:t>
+      </w:r>
+      <w:r>
+        <w:t xml:space="preserve"> INNER JOIN </w:t>
+      </w:r>
+    </w:p>
+    <w:p>
+      <w:pPr>
+        <w:pStyle w:val="Ttulo2"/>
+        <w:jc w:val="both"/>
+      </w:pPr>
+      <w:r>
+        <w:t xml:space="preserve">4.1. </w:t>
+      </w:r>
+      <w:r>
+        <w:t>Consulta 1</w:t>
+      </w:r>
+      <w:r>
+        <w:t xml:space="preserve"> INNER JOIN</w:t>
+      </w:r>
+      <w:r>
+        <w:t>:</w:t>
+      </w:r>
+    </w:p>
+    <w:p>
+      <w:pPr>
+        <w:pStyle w:val="APASEPTIMA"/>
+        <w:ind w:firstLine="0"/>
+      </w:pPr>
+      <w:r>
+        <w:t>Mostrar información detallada de las emergencias, incluyendo el usuario que la atendió, el tipo de emergencia y su ubicación.</w:t>
+      </w:r>
+    </w:p>
+    <w:p>
+      <w:pPr>
+        <w:pStyle w:val="Ttulo2"/>
+      </w:pPr>
+      <w:r>
+        <w:t xml:space="preserve">4.1.1. </w:t>
+      </w:r>
+      <w:r>
+        <w:t xml:space="preserve">Explicación: </w:t>
+      </w:r>
+      <w:r>
+        <w:t xml:space="preserve"> </w:t>
+      </w:r>
+    </w:p>
+    <w:p>
+      <w:pPr>
+        <w:pStyle w:val="APASEPTIMA"/>
+      </w:pPr>
+      <w:r>
+        <w:t xml:space="preserve">La </w:t>
+      </w:r>
+      <w:r>
+        <w:t>primera</w:t>
+      </w:r>
+      <w:r>
+        <w:t xml:space="preserve"> consulta realizada para en la práctica constituye a una consulta avanzada utilizando LEFT JOIN para traer todos los registros existentes en la tabla alertas para que ninguna emergencia quede sin ser consultada. </w:t>
+      </w:r>
+    </w:p>
+    <w:p>
+      <w:pPr>
+        <w:pStyle w:val="APASEPTIMA"/>
+        <w:rPr>
+          <w:u w:val="single"/>
+        </w:rPr>
+      </w:pPr>
+      <w:r>
+        <w:t xml:space="preserve">Finalmente, para consultar los datos como: el estado, ubicación e institución a quien pertenece cada emergencia se hizo uso del INNER JOIN, el cual nos permite traer los registros externos en las tablas “tipos_emergencia, instituciones y ubicaciones”, que se relaciones con una emergencia en “alertas” mostrara esos datos al realizar dicha consulta: </w:t>
+      </w:r>
+    </w:p>
+    <w:p>
+      <w:pPr>
+        <w:pStyle w:val="Ttulo2"/>
+        <w:jc w:val="both"/>
+      </w:pPr>
+      <w:r>
+        <w:t xml:space="preserve">4.1.2. </w:t>
+      </w:r>
+      <w:r>
+        <w:t>Evidencia de ejecución</w:t>
+      </w:r>
+      <w:r>
+        <w:t>:</w:t>
+      </w:r>
+    </w:p>
+    <w:p>
+      <w:pPr>
+        <w:pStyle w:val="APASEPTIMA"/>
+        <w:rPr>
+          <w:u w:val="single"/>
+        </w:rPr>
+      </w:pPr>
+      <w:r>
+        <w:t xml:space="preserve"> </w:t>
+      </w:r>
+      <w:r>
+        <w:t>La</w:t>
+      </w:r>
+      <w:r>
+        <w:t xml:space="preserve"> sentencia SQL, diseñada para obtener datos más completos de cada emergencia registrada utilizando INNER JOIN</w:t>
+      </w:r>
+      <w:r>
+        <w:t>, se presenta a continuación en la siguiente captura de pantalla correspondiente a la consulta SELECT utilizada:</w:t>
+      </w:r>
+    </w:p>
+    <w:p>
+      <w:pPr>
+        <w:rPr>
+          <w:u w:val="single"/>
+        </w:rPr>
+      </w:pPr>
+      <w:r>
+        <w:rPr>
+          <w:noProof/>
+        </w:rPr>
+        <w:drawing>
+          <wp:inline distT="0" distB="0" distL="0" distR="0" wp14:anchorId="7CC0EF4C" wp14:editId="620DAA66">
+            <wp:extent cx="5943600" cy="2611120"/>
+            <wp:effectExtent l="0" t="0" r="0" b="0"/>
+            <wp:docPr id="888984084" name="Imagen 1"/>
+            <wp:cNvGraphicFramePr>
+              <a:graphicFrameLocks xmlns:a="http://schemas.openxmlformats.org/drawingml/2006/main" noChangeAspect="1"/>
+            </wp:cNvGraphicFramePr>
+            <a:graphic xmlns:a="http://schemas.openxmlformats.org/drawingml/2006/main">
+              <a:graphicData uri="http://schemas.openxmlformats.org/drawingml/2006/picture">
+                <pic:pic xmlns:pic="http://schemas.openxmlformats.org/drawingml/2006/picture">
+                  <pic:nvPicPr>
+                    <pic:cNvPr id="888984084" name=""/>
+                    <pic:cNvPicPr/>
+                  </pic:nvPicPr>
+                  <pic:blipFill>
+                    <a:blip r:embed="rId10"/>
+                    <a:stretch>
+                      <a:fillRect/>
+                    </a:stretch>
+                  </pic:blipFill>
+                  <pic:spPr>
+                    <a:xfrm>
+                      <a:off x="0" y="0"/>
+                      <a:ext cx="5943600" cy="2611120"/>
+                    </a:xfrm>
+                    <a:prstGeom prst="rect">
+                      <a:avLst/>
+                    </a:prstGeom>
+                  </pic:spPr>
+                </pic:pic>
+              </a:graphicData>
+            </a:graphic>
+          </wp:inline>
+        </w:drawing>
+      </w:r>
+    </w:p>
+    <w:p>
+      <w:pPr>
+        <w:pStyle w:val="APASEPTIMA"/>
+        <w:ind w:firstLine="0"/>
+        <w:rPr>
+          <w:u w:val="single"/>
+        </w:rPr>
+      </w:pPr>
+      <w:r>
+        <w:rPr>
+          <w:b/>
+          <w:bCs/>
+        </w:rPr>
+        <w:lastRenderedPageBreak/>
+        <w:t>Resultado</w:t>
+      </w:r>
+      <w:r>
+        <w:rPr>
+          <w:b/>
+          <w:bCs/>
+        </w:rPr>
+        <w:t>:</w:t>
+      </w:r>
+      <w:r>
+        <w:t xml:space="preserve"> El resultado obtenido al ejecutar la instrucción SQL fue una tabla con los datos de cada emergencia más completa y profesional, mostrando la ubicación en que origino la emergencia, el tipo y el usuario que la </w:t>
+      </w:r>
+      <w:r>
+        <w:t>atendió</w:t>
+      </w:r>
+      <w:r>
+        <w:t>.</w:t>
+      </w:r>
+    </w:p>
+    <w:p>
+      <w:r>
+        <w:rPr>
+          <w:noProof/>
+        </w:rPr>
+        <w:drawing>
+          <wp:inline distT="0" distB="0" distL="0" distR="0" wp14:anchorId="10C92B89" wp14:editId="0AA7F3AA">
+            <wp:extent cx="5943600" cy="3143250"/>
+            <wp:effectExtent l="0" t="0" r="0" b="0"/>
+            <wp:docPr id="524729301" name="Imagen 1"/>
+            <wp:cNvGraphicFramePr>
+              <a:graphicFrameLocks xmlns:a="http://schemas.openxmlformats.org/drawingml/2006/main" noChangeAspect="1"/>
+            </wp:cNvGraphicFramePr>
+            <a:graphic xmlns:a="http://schemas.openxmlformats.org/drawingml/2006/main">
+              <a:graphicData uri="http://schemas.openxmlformats.org/drawingml/2006/picture">
+                <pic:pic xmlns:pic="http://schemas.openxmlformats.org/drawingml/2006/picture">
+                  <pic:nvPicPr>
+                    <pic:cNvPr id="524729301" name=""/>
+                    <pic:cNvPicPr/>
+                  </pic:nvPicPr>
+                  <pic:blipFill>
+                    <a:blip r:embed="rId11"/>
+                    <a:stretch>
+                      <a:fillRect/>
+                    </a:stretch>
+                  </pic:blipFill>
+                  <pic:spPr>
+                    <a:xfrm>
+                      <a:off x="0" y="0"/>
+                      <a:ext cx="5943600" cy="3143250"/>
+                    </a:xfrm>
+                    <a:prstGeom prst="rect">
+                      <a:avLst/>
+                    </a:prstGeom>
+                  </pic:spPr>
+                </pic:pic>
+              </a:graphicData>
+            </a:graphic>
+          </wp:inline>
+        </w:drawing>
+      </w:r>
+    </w:p>
+    <w:p>
+      <w:pPr>
+        <w:pStyle w:val="TtuloNormal"/>
+      </w:pPr>
+      <w:r>
+        <w:t xml:space="preserve">4.2. </w:t>
+      </w:r>
+      <w:r>
+        <w:t>Consulta 2</w:t>
+      </w:r>
+      <w:r>
+        <w:t xml:space="preserve"> INNER JOIN: </w:t>
+      </w:r>
+    </w:p>
+    <w:p>
+      <w:pPr>
+        <w:pStyle w:val="APASEPTIMA"/>
+        <w:ind w:firstLine="0"/>
+      </w:pPr>
+      <w:r>
+        <w:t>Mostrar las emergencias registradas en el Edificio A, indicando el tipo de emergencia, su descripción, fecha, hora y estado,</w:t>
+      </w:r>
+      <w:r>
+        <w:t xml:space="preserve"> </w:t>
+      </w:r>
+      <w:r>
+        <w:t>ordenadas de la más reciente a la más antigua.</w:t>
+      </w:r>
+    </w:p>
+    <w:p>
+      <w:pPr>
+        <w:pStyle w:val="Ttulo2"/>
+      </w:pPr>
+      <w:r>
+        <w:t xml:space="preserve">4.2.1. Explicación: </w:t>
+      </w:r>
+    </w:p>
+    <w:p>
+      <w:pPr>
+        <w:pStyle w:val="APASEPTIMA"/>
+      </w:pPr>
+      <w:r>
+        <w:t xml:space="preserve">La segunda consulta realizada en la práctica constituye </w:t>
+      </w:r>
+      <w:r>
+        <w:t xml:space="preserve">en </w:t>
+      </w:r>
+      <w:r>
+        <w:t xml:space="preserve">consultar únicamente las emergencias correspondientes al “Edificio A” y obtener los datos como: tipo de emergencia, ubicación, fecha, hora y estado, se hizo uso del INNER JOIN, </w:t>
+      </w:r>
+      <w:r>
+        <w:t>mediante el</w:t>
+      </w:r>
+      <w:r>
+        <w:t xml:space="preserve"> cual</w:t>
+      </w:r>
+      <w:r>
+        <w:t xml:space="preserve"> fue posible</w:t>
+      </w:r>
+      <w:r>
+        <w:t xml:space="preserve"> relacionar los registros de las tablas “tipos_emergencia” y “ubicaciones” con los registros de la </w:t>
+      </w:r>
+      <w:r>
+        <w:t>tabla “alertas” que coinciden entre ellas.</w:t>
+      </w:r>
+    </w:p>
+    <w:p>
+      <w:pPr>
+        <w:pStyle w:val="APASEPTIMA"/>
+      </w:pPr>
+      <w:r>
+        <w:t>S</w:t>
+      </w:r>
+      <w:r>
+        <w:t>e utilizó la condición WHERE para filtrar únicamente las emergencias que pertenecen al “Edificio A” y ORDER BY para ordenar los resultados desde la emergencia más reciente hasta la más antigua</w:t>
+      </w:r>
+    </w:p>
+    <w:p>
+      <w:pPr>
+        <w:pStyle w:val="Ttulo2"/>
+      </w:pPr>
+      <w:r>
+        <w:lastRenderedPageBreak/>
+        <w:t>4.2.2. Evidencia de ejecución:</w:t>
+      </w:r>
+    </w:p>
+    <w:p>
+      <w:pPr>
+        <w:pStyle w:val="APASEPTIMA"/>
+        <w:rPr>
+          <w:u w:val="single"/>
+        </w:rPr>
+      </w:pPr>
+      <w:r>
+        <w:t>La sentencia SQL, diseñada para obtener las emergencias registradas en el “Edificio A” utilizando INNER JOIN, se presenta a continuación en la siguiente captura de pantalla</w:t>
+      </w:r>
+      <w:r>
+        <w:t>:</w:t>
+      </w:r>
+    </w:p>
+    <w:p>
+      <w:pPr>
+        <w:pStyle w:val="APASEPTIMA"/>
+        <w:ind w:firstLine="0"/>
+      </w:pPr>
+      <w:r>
+        <w:rPr>
+          <w:noProof/>
+        </w:rPr>
+        <w:drawing>
+          <wp:inline distT="0" distB="0" distL="0" distR="0" wp14:anchorId="72033A63" wp14:editId="3FBBBFA6">
+            <wp:extent cx="5943600" cy="2277110"/>
+            <wp:effectExtent l="0" t="0" r="0" b="8890"/>
+            <wp:docPr id="1919287615" name="Imagen 1"/>
+            <wp:cNvGraphicFramePr>
+              <a:graphicFrameLocks xmlns:a="http://schemas.openxmlformats.org/drawingml/2006/main" noChangeAspect="1"/>
+            </wp:cNvGraphicFramePr>
+            <a:graphic xmlns:a="http://schemas.openxmlformats.org/drawingml/2006/main">
+              <a:graphicData uri="http://schemas.openxmlformats.org/drawingml/2006/picture">
+                <pic:pic xmlns:pic="http://schemas.openxmlformats.org/drawingml/2006/picture">
+                  <pic:nvPicPr>
+                    <pic:cNvPr id="1919287615" name=""/>
+                    <pic:cNvPicPr/>
+                  </pic:nvPicPr>
+                  <pic:blipFill>
+                    <a:blip r:embed="rId12"/>
+                    <a:stretch>
+                      <a:fillRect/>
+                    </a:stretch>
+                  </pic:blipFill>
+                  <pic:spPr>
+                    <a:xfrm>
+                      <a:off x="0" y="0"/>
+                      <a:ext cx="5943600" cy="2277110"/>
+                    </a:xfrm>
+                    <a:prstGeom prst="rect">
+                      <a:avLst/>
+                    </a:prstGeom>
+                  </pic:spPr>
+                </pic:pic>
+              </a:graphicData>
+            </a:graphic>
+          </wp:inline>
+        </w:drawing>
+      </w:r>
+    </w:p>
+    <w:p>
+      <w:pPr>
+        <w:pStyle w:val="APASEPTIMA"/>
+        <w:ind w:firstLine="0"/>
+      </w:pPr>
+      <w:r>
+        <w:rPr>
+          <w:b/>
+          <w:bCs/>
+        </w:rPr>
+        <w:t>Resultado:</w:t>
+      </w:r>
+      <w:r>
+        <w:t xml:space="preserve"> El resultado obtenido al ejecutar la instrucción SQL fue una tabla con las emergencias registradas en el “Edificio A”, mostrando información como el tipo de emergencia, descripción, ubicación, fecha, hora y estado, ordenadas desde la más reciente hasta la más antigua.</w:t>
+      </w:r>
+    </w:p>
+    <w:p>
+      <w:pPr>
+        <w:pStyle w:val="APASEPTIMA"/>
+        <w:ind w:firstLine="0"/>
+        <w:rPr>
+          <w:u w:val="single"/>
+        </w:rPr>
+      </w:pPr>
+      <w:r>
+        <w:rPr>
+          <w:noProof/>
+        </w:rPr>
+        <w:drawing>
+          <wp:inline distT="0" distB="0" distL="0" distR="0" wp14:anchorId="7AA4BAC4" wp14:editId="4877D784">
+            <wp:extent cx="5943600" cy="2629535"/>
+            <wp:effectExtent l="0" t="0" r="0" b="0"/>
+            <wp:docPr id="1510505703" name="Imagen 1"/>
+            <wp:cNvGraphicFramePr>
+              <a:graphicFrameLocks xmlns:a="http://schemas.openxmlformats.org/drawingml/2006/main" noChangeAspect="1"/>
+            </wp:cNvGraphicFramePr>
+            <a:graphic xmlns:a="http://schemas.openxmlformats.org/drawingml/2006/main">
+              <a:graphicData uri="http://schemas.openxmlformats.org/drawingml/2006/picture">
+                <pic:pic xmlns:pic="http://schemas.openxmlformats.org/drawingml/2006/picture">
+                  <pic:nvPicPr>
+                    <pic:cNvPr id="1510505703" name=""/>
+                    <pic:cNvPicPr/>
+                  </pic:nvPicPr>
+                  <pic:blipFill>
+                    <a:blip r:embed="rId13"/>
+                    <a:stretch>
+                      <a:fillRect/>
+                    </a:stretch>
+                  </pic:blipFill>
+                  <pic:spPr>
+                    <a:xfrm>
+                      <a:off x="0" y="0"/>
+                      <a:ext cx="5943600" cy="2629535"/>
+                    </a:xfrm>
+                    <a:prstGeom prst="rect">
+                      <a:avLst/>
+                    </a:prstGeom>
+                  </pic:spPr>
+                </pic:pic>
+              </a:graphicData>
+            </a:graphic>
+          </wp:inline>
+        </w:drawing>
+      </w:r>
+    </w:p>
+    <w:p>
+      <w:pPr>
+        <w:rPr>
+          <w:u w:val="single"/>
+        </w:rPr>
+      </w:pPr>
+    </w:p>
+    <w:p/>
+    <w:p>
+      <w:pPr>
+        <w:pStyle w:val="Ttulo1"/>
+      </w:pPr>
+      <w:r>
+        <w:lastRenderedPageBreak/>
         <w:t xml:space="preserve">5. </w:t>
       </w:r>
       <w:r>
@@ -884,46 +2161,1072 @@
     </w:p>
     <w:p>
       <w:pPr>
-        <w:numPr>
-          <w:ilvl w:val="0"/>
-          <w:numId w:val="2"/>
-        </w:numPr>
-      </w:pPr>
-      <w:r>
-        <w:t xml:space="preserve">Consulta 1 </w:t>
-      </w:r>
-    </w:p>
-    <w:p>
-      <w:pPr>
-        <w:numPr>
-          <w:ilvl w:val="0"/>
-          <w:numId w:val="2"/>
-        </w:numPr>
-      </w:pPr>
-      <w:r>
-        <w:t xml:space="preserve">Consulta 2 </w:t>
-      </w:r>
-    </w:p>
-    <w:p>
-      <w:pPr>
-        <w:numPr>
-          <w:ilvl w:val="0"/>
-          <w:numId w:val="2"/>
-        </w:numPr>
-      </w:pPr>
-      <w:r>
-        <w:t xml:space="preserve">Consulta 3 </w:t>
-      </w:r>
-    </w:p>
-    <w:p>
-      <w:pPr>
-        <w:numPr>
-          <w:ilvl w:val="0"/>
-          <w:numId w:val="2"/>
-        </w:numPr>
-      </w:pPr>
-      <w:r>
-        <w:t xml:space="preserve">Evidencias y explicación de cada resultado </w:t>
+        <w:pStyle w:val="APASEPTIMA"/>
+        <w:rPr>
+          <w:u w:val="single"/>
+        </w:rPr>
+      </w:pPr>
+      <w:r>
+        <w:t>En la presente sección se presentan las consultas implementadas utilizando funciones de agregación com</w:t>
+      </w:r>
+      <w:r>
+        <w:t>o (COUNT)</w:t>
+      </w:r>
+      <w:r>
+        <w:t xml:space="preserve"> </w:t>
+      </w:r>
+      <w:r>
+        <w:t xml:space="preserve">y </w:t>
+      </w:r>
+      <w:r>
+        <w:t xml:space="preserve">la </w:t>
+      </w:r>
+      <w:r>
+        <w:t>agrupa</w:t>
+      </w:r>
+      <w:r>
+        <w:t>ción de</w:t>
+      </w:r>
+      <w:r>
+        <w:t xml:space="preserve"> filas</w:t>
+      </w:r>
+      <w:r>
+        <w:t xml:space="preserve"> con </w:t>
+      </w:r>
+      <w:r>
+        <w:t>GROUP BY</w:t>
+      </w:r>
+      <w:r>
+        <w:t>.</w:t>
+      </w:r>
+      <w:r>
+        <w:t xml:space="preserve"> </w:t>
+      </w:r>
+      <w:r>
+        <w:t>C</w:t>
+      </w:r>
+      <w:r>
+        <w:t xml:space="preserve">abe recalcar que en las consultas presentadas no se utilizaron funciones como: AVG, </w:t>
+      </w:r>
+      <w:r>
+        <w:t>SUM</w:t>
+      </w:r>
+      <w:r>
+        <w:t xml:space="preserve">, </w:t>
+      </w:r>
+      <w:r>
+        <w:t>porque</w:t>
+      </w:r>
+      <w:r>
+        <w:t xml:space="preserve"> la información almacenada en la tabla alertas, corresponde a tipos de datos (varchar), y estas funciones trabajan con tipos de datos numéricos, lo que hace que no se puedan aplicar directamente en la tabla alertas, por</w:t>
+      </w:r>
+      <w:r>
+        <w:t xml:space="preserve"> la razón de que </w:t>
+      </w:r>
+      <w:r>
+        <w:t>no aceptan tipos de datos de texto.</w:t>
+      </w:r>
+    </w:p>
+    <w:p>
+      <w:pPr>
+        <w:pStyle w:val="TtuloNormal"/>
+      </w:pPr>
+      <w:r>
+        <w:t xml:space="preserve">5.1. </w:t>
+      </w:r>
+      <w:r>
+        <w:t>Consulta 1</w:t>
+      </w:r>
+      <w:r>
+        <w:t xml:space="preserve">: </w:t>
+      </w:r>
+      <w:r>
+        <w:rPr>
+          <w:b w:val="0"/>
+          <w:bCs/>
+        </w:rPr>
+        <w:t>¿</w:t>
+      </w:r>
+      <w:r>
+        <w:rPr>
+          <w:b w:val="0"/>
+          <w:bCs/>
+        </w:rPr>
+        <w:t>Cuantas emergencias por tipo se encuentran activas?</w:t>
+      </w:r>
+      <w:r>
+        <w:t xml:space="preserve"> </w:t>
+      </w:r>
+    </w:p>
+    <w:p>
+      <w:pPr>
+        <w:pStyle w:val="TtuloNormal"/>
+        <w:jc w:val="both"/>
+      </w:pPr>
+      <w:r>
+        <w:t>5.1.2. Explicación:</w:t>
+      </w:r>
+      <w:r>
+        <w:t xml:space="preserve"> </w:t>
+      </w:r>
+      <w:r>
+        <w:rPr>
+          <w:b w:val="0"/>
+          <w:bCs/>
+        </w:rPr>
+        <w:t>Para darle repuesta a esta pregunta relacionada con las necesidades reales que el sistema puede tener, se utilizó COUNT Y GROUP BY</w:t>
+      </w:r>
+      <w:r>
+        <w:rPr>
+          <w:b w:val="0"/>
+          <w:bCs/>
+        </w:rPr>
+        <w:t>, para agrupar exactamente todos los registros de alertas, agrupadas por tipo de emergencia y para mostrar solo las emergencias activas se utilizó WHERE para mostrar solo emergencias de estado activa y contar cuantas existen por tipo:</w:t>
+      </w:r>
+    </w:p>
+    <w:p>
+      <w:pPr>
+        <w:pStyle w:val="APASEPTIMA"/>
+        <w:ind w:firstLine="0"/>
+      </w:pPr>
+      <w:r>
+        <w:rPr>
+          <w:noProof/>
+        </w:rPr>
+        <w:drawing>
+          <wp:inline distT="0" distB="0" distL="0" distR="0" wp14:anchorId="2395008B" wp14:editId="666A1ACC">
+            <wp:extent cx="5943600" cy="1571625"/>
+            <wp:effectExtent l="0" t="0" r="0" b="9525"/>
+            <wp:docPr id="1330343097" name="Imagen 1"/>
+            <wp:cNvGraphicFramePr>
+              <a:graphicFrameLocks xmlns:a="http://schemas.openxmlformats.org/drawingml/2006/main" noChangeAspect="1"/>
+            </wp:cNvGraphicFramePr>
+            <a:graphic xmlns:a="http://schemas.openxmlformats.org/drawingml/2006/main">
+              <a:graphicData uri="http://schemas.openxmlformats.org/drawingml/2006/picture">
+                <pic:pic xmlns:pic="http://schemas.openxmlformats.org/drawingml/2006/picture">
+                  <pic:nvPicPr>
+                    <pic:cNvPr id="1330343097" name=""/>
+                    <pic:cNvPicPr/>
+                  </pic:nvPicPr>
+                  <pic:blipFill>
+                    <a:blip r:embed="rId14"/>
+                    <a:stretch>
+                      <a:fillRect/>
+                    </a:stretch>
+                  </pic:blipFill>
+                  <pic:spPr>
+                    <a:xfrm>
+                      <a:off x="0" y="0"/>
+                      <a:ext cx="5943600" cy="1571625"/>
+                    </a:xfrm>
+                    <a:prstGeom prst="rect">
+                      <a:avLst/>
+                    </a:prstGeom>
+                  </pic:spPr>
+                </pic:pic>
+              </a:graphicData>
+            </a:graphic>
+          </wp:inline>
+        </w:drawing>
+      </w:r>
+    </w:p>
+    <w:p>
+      <w:pPr>
+        <w:pStyle w:val="APASEPTIMA"/>
+        <w:ind w:firstLine="0"/>
+      </w:pPr>
+      <w:r>
+        <w:rPr>
+          <w:rStyle w:val="TtuloNormalCar"/>
+        </w:rPr>
+        <w:t>5.</w:t>
+      </w:r>
+      <w:r>
+        <w:rPr>
+          <w:rStyle w:val="TtuloNormalCar"/>
+        </w:rPr>
+        <w:t>1.</w:t>
+      </w:r>
+      <w:r>
+        <w:rPr>
+          <w:rStyle w:val="TtuloNormalCar"/>
+        </w:rPr>
+        <w:t>2</w:t>
+      </w:r>
+      <w:r>
+        <w:rPr>
+          <w:rStyle w:val="TtuloNormalCar"/>
+        </w:rPr>
+        <w:t xml:space="preserve">. </w:t>
+      </w:r>
+      <w:r>
+        <w:rPr>
+          <w:rStyle w:val="TtuloNormalCar"/>
+        </w:rPr>
+        <w:t>Resultado</w:t>
+      </w:r>
+      <w:r>
+        <w:t xml:space="preserve">: </w:t>
+      </w:r>
+      <w:r>
+        <w:t>Al realizar la ejecución de la consulta SQL, se obtuvieron exitosamente 2 registros agrupados por estado y tipo de emergencia, mostrando la cantidad exacta de emergencias registradas con estado “ACTIVA” según su tipo de emergencia (médica, seguridad e incendio)</w:t>
+      </w:r>
+      <w:r>
+        <w:t>.</w:t>
+      </w:r>
+    </w:p>
+    <w:p>
+      <w:pPr>
+        <w:pStyle w:val="APASEPTIMA"/>
+        <w:ind w:firstLine="0"/>
+        <w:rPr>
+          <w:u w:val="single"/>
+        </w:rPr>
+      </w:pPr>
+      <w:r>
+        <w:rPr>
+          <w:noProof/>
+        </w:rPr>
+        <w:lastRenderedPageBreak/>
+        <w:drawing>
+          <wp:inline distT="0" distB="0" distL="0" distR="0" wp14:anchorId="1A86F7D7" wp14:editId="6BD92805">
+            <wp:extent cx="5943600" cy="2487295"/>
+            <wp:effectExtent l="0" t="0" r="0" b="8255"/>
+            <wp:docPr id="321389189" name="Imagen 1"/>
+            <wp:cNvGraphicFramePr>
+              <a:graphicFrameLocks xmlns:a="http://schemas.openxmlformats.org/drawingml/2006/main" noChangeAspect="1"/>
+            </wp:cNvGraphicFramePr>
+            <a:graphic xmlns:a="http://schemas.openxmlformats.org/drawingml/2006/main">
+              <a:graphicData uri="http://schemas.openxmlformats.org/drawingml/2006/picture">
+                <pic:pic xmlns:pic="http://schemas.openxmlformats.org/drawingml/2006/picture">
+                  <pic:nvPicPr>
+                    <pic:cNvPr id="321389189" name=""/>
+                    <pic:cNvPicPr/>
+                  </pic:nvPicPr>
+                  <pic:blipFill>
+                    <a:blip r:embed="rId15"/>
+                    <a:stretch>
+                      <a:fillRect/>
+                    </a:stretch>
+                  </pic:blipFill>
+                  <pic:spPr>
+                    <a:xfrm>
+                      <a:off x="0" y="0"/>
+                      <a:ext cx="5943600" cy="2487295"/>
+                    </a:xfrm>
+                    <a:prstGeom prst="rect">
+                      <a:avLst/>
+                    </a:prstGeom>
+                  </pic:spPr>
+                </pic:pic>
+              </a:graphicData>
+            </a:graphic>
+          </wp:inline>
+        </w:drawing>
+      </w:r>
+    </w:p>
+    <w:p>
+      <w:pPr>
+        <w:pStyle w:val="APASEPTIMA"/>
+        <w:ind w:firstLine="0"/>
+        <w:rPr>
+          <w:u w:val="single"/>
+        </w:rPr>
+      </w:pPr>
+    </w:p>
+    <w:p>
+      <w:pPr>
+        <w:pStyle w:val="TtuloNormal"/>
+        <w:jc w:val="both"/>
+        <w:rPr>
+          <w:b w:val="0"/>
+          <w:bCs/>
+        </w:rPr>
+      </w:pPr>
+      <w:r>
+        <w:t xml:space="preserve">5.2. </w:t>
+      </w:r>
+      <w:r>
+        <w:t>Consulta 2</w:t>
+      </w:r>
+      <w:r>
+        <w:t xml:space="preserve">: </w:t>
+      </w:r>
+      <w:r>
+        <w:rPr>
+          <w:b w:val="0"/>
+          <w:bCs/>
+        </w:rPr>
+        <w:t>¿Cuántas emergencias han ocurrido en el la institución educativa según su tipo?</w:t>
+      </w:r>
+    </w:p>
+    <w:p>
+      <w:pPr>
+        <w:pStyle w:val="TtuloNormal"/>
+        <w:jc w:val="both"/>
+      </w:pPr>
+      <w:r>
+        <w:t xml:space="preserve">5.2.1. Explicación: </w:t>
+      </w:r>
+      <w:r>
+        <w:t xml:space="preserve"> </w:t>
+      </w:r>
+      <w:r>
+        <w:rPr>
+          <w:b w:val="0"/>
+          <w:bCs/>
+        </w:rPr>
+        <w:t xml:space="preserve">En esta segunda consulta, se </w:t>
+      </w:r>
+      <w:r>
+        <w:rPr>
+          <w:b w:val="0"/>
+          <w:bCs/>
+        </w:rPr>
+        <w:t xml:space="preserve">utilizó </w:t>
+      </w:r>
+      <w:r>
+        <w:rPr>
+          <w:b w:val="0"/>
+          <w:bCs/>
+        </w:rPr>
+        <w:t xml:space="preserve">igualmente </w:t>
+      </w:r>
+      <w:r>
+        <w:rPr>
+          <w:b w:val="0"/>
+          <w:bCs/>
+        </w:rPr>
+        <w:t>COUNT y GROUP BY, para contar y agrupar todos los registros de emergencias según el tipo de emergencia ocurrido dentro de la institución educativa.</w:t>
+      </w:r>
+    </w:p>
+    <w:p>
+      <w:pPr>
+        <w:pStyle w:val="APASEPTIMA"/>
+      </w:pPr>
+      <w:r>
+        <w:t>Además,</w:t>
+      </w:r>
+      <w:r>
+        <w:t xml:space="preserve"> para consultar datos completos y consistentes</w:t>
+      </w:r>
+      <w:r>
+        <w:t xml:space="preserve"> se utilizó LEFT JOIN e INNER JOIN para relacionar los registros de la tabla “alertas” con las tablas “tipos_emergencia”, “ubicaciones” e “instituciones”, </w:t>
+      </w:r>
+      <w:r>
+        <w:t>lo que permitió</w:t>
+      </w:r>
+      <w:r>
+        <w:t xml:space="preserve"> identificar a qué institución pertenece cada emergencia. Finalmente, se utilizó WHERE para mostrar únicamente las emergencias pertenecientes a</w:t>
+      </w:r>
+      <w:r>
+        <w:t xml:space="preserve"> la institución </w:t>
+      </w:r>
+      <w:r>
+        <w:t>“Instituto Católico Karol Wojtyla”.</w:t>
+      </w:r>
+    </w:p>
+    <w:p>
+      <w:pPr>
+        <w:pStyle w:val="APASEPTIMA"/>
+        <w:ind w:firstLine="0"/>
+      </w:pPr>
+      <w:r>
+        <w:rPr>
+          <w:noProof/>
+        </w:rPr>
+        <w:drawing>
+          <wp:inline distT="0" distB="0" distL="0" distR="0" wp14:anchorId="2D586F91" wp14:editId="154ECEB2">
+            <wp:extent cx="5943600" cy="1951355"/>
+            <wp:effectExtent l="0" t="0" r="0" b="0"/>
+            <wp:docPr id="1207610314" name="Imagen 1"/>
+            <wp:cNvGraphicFramePr>
+              <a:graphicFrameLocks xmlns:a="http://schemas.openxmlformats.org/drawingml/2006/main" noChangeAspect="1"/>
+            </wp:cNvGraphicFramePr>
+            <a:graphic xmlns:a="http://schemas.openxmlformats.org/drawingml/2006/main">
+              <a:graphicData uri="http://schemas.openxmlformats.org/drawingml/2006/picture">
+                <pic:pic xmlns:pic="http://schemas.openxmlformats.org/drawingml/2006/picture">
+                  <pic:nvPicPr>
+                    <pic:cNvPr id="1207610314" name=""/>
+                    <pic:cNvPicPr/>
+                  </pic:nvPicPr>
+                  <pic:blipFill>
+                    <a:blip r:embed="rId16"/>
+                    <a:stretch>
+                      <a:fillRect/>
+                    </a:stretch>
+                  </pic:blipFill>
+                  <pic:spPr>
+                    <a:xfrm>
+                      <a:off x="0" y="0"/>
+                      <a:ext cx="5943600" cy="1951355"/>
+                    </a:xfrm>
+                    <a:prstGeom prst="rect">
+                      <a:avLst/>
+                    </a:prstGeom>
+                  </pic:spPr>
+                </pic:pic>
+              </a:graphicData>
+            </a:graphic>
+          </wp:inline>
+        </w:drawing>
+      </w:r>
+    </w:p>
+    <w:p>
+      <w:pPr>
+        <w:pStyle w:val="APASEPTIMA"/>
+        <w:ind w:firstLine="0"/>
+      </w:pPr>
+      <w:r>
+        <w:rPr>
+          <w:b/>
+          <w:bCs/>
+        </w:rPr>
+        <w:lastRenderedPageBreak/>
+        <w:t>5.2.</w:t>
+      </w:r>
+      <w:r>
+        <w:rPr>
+          <w:b/>
+          <w:bCs/>
+        </w:rPr>
+        <w:t>2</w:t>
+      </w:r>
+      <w:r>
+        <w:rPr>
+          <w:b/>
+          <w:bCs/>
+        </w:rPr>
+        <w:t>. Resultado:</w:t>
+      </w:r>
+      <w:r>
+        <w:t xml:space="preserve"> Al realizar la ejecución de la consulta SQL, se obtuvieron exitosamente los registros agrupados por tipo de emergencia, mostrando la cantidad de emergencias que han ocurrido dentro del “Instituto Católico Karol Wojtyla”, según su tipo de emergencia.</w:t>
+      </w:r>
+    </w:p>
+    <w:p>
+      <w:pPr>
+        <w:pStyle w:val="APASEPTIMA"/>
+        <w:ind w:firstLine="0"/>
+      </w:pPr>
+      <w:r>
+        <w:rPr>
+          <w:noProof/>
+        </w:rPr>
+        <w:drawing>
+          <wp:inline distT="0" distB="0" distL="0" distR="0" wp14:anchorId="184FA036" wp14:editId="5FF7D8BB">
+            <wp:extent cx="5943600" cy="2915285"/>
+            <wp:effectExtent l="0" t="0" r="0" b="0"/>
+            <wp:docPr id="868418197" name="Imagen 1"/>
+            <wp:cNvGraphicFramePr>
+              <a:graphicFrameLocks xmlns:a="http://schemas.openxmlformats.org/drawingml/2006/main" noChangeAspect="1"/>
+            </wp:cNvGraphicFramePr>
+            <a:graphic xmlns:a="http://schemas.openxmlformats.org/drawingml/2006/main">
+              <a:graphicData uri="http://schemas.openxmlformats.org/drawingml/2006/picture">
+                <pic:pic xmlns:pic="http://schemas.openxmlformats.org/drawingml/2006/picture">
+                  <pic:nvPicPr>
+                    <pic:cNvPr id="868418197" name=""/>
+                    <pic:cNvPicPr/>
+                  </pic:nvPicPr>
+                  <pic:blipFill>
+                    <a:blip r:embed="rId17"/>
+                    <a:stretch>
+                      <a:fillRect/>
+                    </a:stretch>
+                  </pic:blipFill>
+                  <pic:spPr>
+                    <a:xfrm>
+                      <a:off x="0" y="0"/>
+                      <a:ext cx="5943600" cy="2915285"/>
+                    </a:xfrm>
+                    <a:prstGeom prst="rect">
+                      <a:avLst/>
+                    </a:prstGeom>
+                  </pic:spPr>
+                </pic:pic>
+              </a:graphicData>
+            </a:graphic>
+          </wp:inline>
+        </w:drawing>
+      </w:r>
+    </w:p>
+    <w:p>
+      <w:pPr>
+        <w:pStyle w:val="TtuloNormal"/>
+        <w:rPr>
+          <w:b w:val="0"/>
+          <w:bCs/>
+        </w:rPr>
+      </w:pPr>
+      <w:r>
+        <w:t xml:space="preserve">5.3. </w:t>
+      </w:r>
+      <w:r>
+        <w:t>Consulta 3</w:t>
+      </w:r>
+      <w:r>
+        <w:t xml:space="preserve">: </w:t>
+      </w:r>
+      <w:r>
+        <w:rPr>
+          <w:b w:val="0"/>
+          <w:bCs/>
+        </w:rPr>
+        <w:t>¿Cuántas emergencias hay en la institución educativa divididas por su estado</w:t>
+      </w:r>
+      <w:r>
+        <w:rPr>
+          <w:b w:val="0"/>
+          <w:bCs/>
+        </w:rPr>
+        <w:t>?</w:t>
+      </w:r>
+    </w:p>
+    <w:p>
+      <w:pPr>
+        <w:pStyle w:val="TtuloNormal"/>
+      </w:pPr>
+      <w:r>
+        <w:t>5.</w:t>
+      </w:r>
+      <w:r>
+        <w:t>3</w:t>
+      </w:r>
+      <w:r>
+        <w:t xml:space="preserve">.1. Explicación: </w:t>
+      </w:r>
+      <w:r>
+        <w:t xml:space="preserve"> </w:t>
+      </w:r>
+      <w:r>
+        <w:rPr>
+          <w:b w:val="0"/>
+          <w:bCs/>
+        </w:rPr>
+        <w:t>Se</w:t>
+      </w:r>
+      <w:r>
+        <w:rPr>
+          <w:b w:val="0"/>
+          <w:bCs/>
+        </w:rPr>
+        <w:t xml:space="preserve"> utilizó LEFT JOIN e INNER JOIN para relacionar los registros de la tabla “alertas” con las tablas “ubicaciones” e “instituciones”</w:t>
+      </w:r>
+      <w:r>
+        <w:rPr>
+          <w:b w:val="0"/>
+          <w:bCs/>
+        </w:rPr>
+        <w:t xml:space="preserve">. Acompañado de </w:t>
+      </w:r>
+      <w:r>
+        <w:rPr>
+          <w:b w:val="0"/>
+          <w:bCs/>
+        </w:rPr>
+        <w:t>LEFT JOIN e INNER JOIN para relacionar los registros de la tabla “alertas” con las tablas “ubicaciones” e “instituciones”, permitiendo identificar a qué institución pertenece cada emergencia</w:t>
+      </w:r>
+      <w:r>
+        <w:rPr>
+          <w:b w:val="0"/>
+          <w:bCs/>
+        </w:rPr>
+        <w:t>, p</w:t>
+      </w:r>
+      <w:r>
+        <w:rPr>
+          <w:b w:val="0"/>
+          <w:bCs/>
+        </w:rPr>
+        <w:t>ermitiendo identificar a qué institución pertenece cada emergencia.</w:t>
+      </w:r>
+      <w:r>
+        <w:t xml:space="preserve"> </w:t>
+      </w:r>
+    </w:p>
+    <w:p>
+      <w:pPr>
+        <w:pStyle w:val="APASEPTIMA"/>
+        <w:ind w:firstLine="0"/>
+        <w:rPr>
+          <w:b/>
+        </w:rPr>
+      </w:pPr>
+      <w:r>
+        <w:rPr>
+          <w:noProof/>
+        </w:rPr>
+        <w:drawing>
+          <wp:inline distT="0" distB="0" distL="0" distR="0" wp14:anchorId="296F9CF0" wp14:editId="78D1C248">
+            <wp:extent cx="5943600" cy="1829435"/>
+            <wp:effectExtent l="0" t="0" r="0" b="0"/>
+            <wp:docPr id="1868896286" name="Imagen 1"/>
+            <wp:cNvGraphicFramePr>
+              <a:graphicFrameLocks xmlns:a="http://schemas.openxmlformats.org/drawingml/2006/main" noChangeAspect="1"/>
+            </wp:cNvGraphicFramePr>
+            <a:graphic xmlns:a="http://schemas.openxmlformats.org/drawingml/2006/main">
+              <a:graphicData uri="http://schemas.openxmlformats.org/drawingml/2006/picture">
+                <pic:pic xmlns:pic="http://schemas.openxmlformats.org/drawingml/2006/picture">
+                  <pic:nvPicPr>
+                    <pic:cNvPr id="1868896286" name=""/>
+                    <pic:cNvPicPr/>
+                  </pic:nvPicPr>
+                  <pic:blipFill>
+                    <a:blip r:embed="rId18"/>
+                    <a:stretch>
+                      <a:fillRect/>
+                    </a:stretch>
+                  </pic:blipFill>
+                  <pic:spPr>
+                    <a:xfrm>
+                      <a:off x="0" y="0"/>
+                      <a:ext cx="5943600" cy="1829435"/>
+                    </a:xfrm>
+                    <a:prstGeom prst="rect">
+                      <a:avLst/>
+                    </a:prstGeom>
+                  </pic:spPr>
+                </pic:pic>
+              </a:graphicData>
+            </a:graphic>
+          </wp:inline>
+        </w:drawing>
+      </w:r>
+    </w:p>
+    <w:p>
+      <w:pPr>
+        <w:pStyle w:val="APASEPTIMA"/>
+        <w:ind w:firstLine="0"/>
+        <w:rPr>
+          <w:bCs/>
+        </w:rPr>
+      </w:pPr>
+      <w:r>
+        <w:rPr>
+          <w:b/>
+          <w:bCs/>
+        </w:rPr>
+        <w:lastRenderedPageBreak/>
+        <w:t>5.3.</w:t>
+      </w:r>
+      <w:r>
+        <w:rPr>
+          <w:b/>
+          <w:bCs/>
+        </w:rPr>
+        <w:t>2</w:t>
+      </w:r>
+      <w:r>
+        <w:rPr>
+          <w:b/>
+          <w:bCs/>
+        </w:rPr>
+        <w:t>. Resultado:</w:t>
+      </w:r>
+      <w:r>
+        <w:rPr>
+          <w:b/>
+        </w:rPr>
+        <w:t xml:space="preserve"> </w:t>
+      </w:r>
+      <w:r>
+        <w:rPr>
+          <w:bCs/>
+        </w:rPr>
+        <w:t xml:space="preserve">Al realizar la ejecución de la consulta SQL, se obtuvieron exitosamente </w:t>
+      </w:r>
+      <w:r>
+        <w:rPr>
+          <w:bCs/>
+        </w:rPr>
+        <w:t>3</w:t>
+      </w:r>
+      <w:r>
+        <w:rPr>
+          <w:bCs/>
+        </w:rPr>
+        <w:t xml:space="preserve"> registros agrupados por estado, mostrando la cantidad de emergencias existentes en el “Instituto Católico Karol Wojtyla” </w:t>
+      </w:r>
+      <w:r>
+        <w:rPr>
+          <w:bCs/>
+        </w:rPr>
+        <w:t>agrupadas por</w:t>
+      </w:r>
+      <w:r>
+        <w:rPr>
+          <w:bCs/>
+        </w:rPr>
+        <w:t xml:space="preserve"> su estado, como activa, atendida, en proceso y falsa.</w:t>
+      </w:r>
+    </w:p>
+    <w:p>
+      <w:pPr>
+        <w:pStyle w:val="APASEPTIMA"/>
+        <w:ind w:firstLine="0"/>
+        <w:rPr>
+          <w:b/>
+        </w:rPr>
+      </w:pPr>
+      <w:r>
+        <w:rPr>
+          <w:noProof/>
+        </w:rPr>
+        <w:drawing>
+          <wp:inline distT="0" distB="0" distL="0" distR="0" wp14:anchorId="1215F82E" wp14:editId="76F3028E">
+            <wp:extent cx="5943600" cy="3197225"/>
+            <wp:effectExtent l="0" t="0" r="0" b="3175"/>
+            <wp:docPr id="230457995" name="Imagen 1"/>
+            <wp:cNvGraphicFramePr>
+              <a:graphicFrameLocks xmlns:a="http://schemas.openxmlformats.org/drawingml/2006/main" noChangeAspect="1"/>
+            </wp:cNvGraphicFramePr>
+            <a:graphic xmlns:a="http://schemas.openxmlformats.org/drawingml/2006/main">
+              <a:graphicData uri="http://schemas.openxmlformats.org/drawingml/2006/picture">
+                <pic:pic xmlns:pic="http://schemas.openxmlformats.org/drawingml/2006/picture">
+                  <pic:nvPicPr>
+                    <pic:cNvPr id="230457995" name=""/>
+                    <pic:cNvPicPr/>
+                  </pic:nvPicPr>
+                  <pic:blipFill>
+                    <a:blip r:embed="rId19"/>
+                    <a:stretch>
+                      <a:fillRect/>
+                    </a:stretch>
+                  </pic:blipFill>
+                  <pic:spPr>
+                    <a:xfrm>
+                      <a:off x="0" y="0"/>
+                      <a:ext cx="5943600" cy="3197225"/>
+                    </a:xfrm>
+                    <a:prstGeom prst="rect">
+                      <a:avLst/>
+                    </a:prstGeom>
+                  </pic:spPr>
+                </pic:pic>
+              </a:graphicData>
+            </a:graphic>
+          </wp:inline>
+        </w:drawing>
+      </w:r>
+    </w:p>
+    <w:p>
+      <w:pPr>
+        <w:pStyle w:val="TtuloNormal"/>
+        <w:rPr>
+          <w:b w:val="0"/>
+          <w:bCs/>
+        </w:rPr>
+      </w:pPr>
+      <w:r>
+        <w:t xml:space="preserve">5.4. </w:t>
+      </w:r>
+      <w:r>
+        <w:t xml:space="preserve">Consulta 4: </w:t>
+      </w:r>
+      <w:r>
+        <w:rPr>
+          <w:b w:val="0"/>
+          <w:bCs/>
+        </w:rPr>
+        <w:t xml:space="preserve">¿Cuáles son las ubicaciones dentro </w:t>
+      </w:r>
+      <w:r>
+        <w:rPr>
+          <w:b w:val="0"/>
+          <w:bCs/>
+        </w:rPr>
+        <w:t>de</w:t>
+      </w:r>
+      <w:r>
+        <w:rPr>
+          <w:b w:val="0"/>
+          <w:bCs/>
+        </w:rPr>
+        <w:t xml:space="preserve"> la institución que han registrado más de 1 emergencia</w:t>
+      </w:r>
+      <w:r>
+        <w:rPr>
+          <w:b w:val="0"/>
+          <w:bCs/>
+        </w:rPr>
+        <w:t>?</w:t>
+      </w:r>
+    </w:p>
+    <w:p>
+      <w:pPr>
+        <w:pStyle w:val="APASEPTIMA"/>
+        <w:ind w:firstLine="0"/>
+      </w:pPr>
+      <w:r>
+        <w:rPr>
+          <w:b/>
+          <w:bCs/>
+        </w:rPr>
+        <w:t>5.</w:t>
+      </w:r>
+      <w:r>
+        <w:rPr>
+          <w:b/>
+          <w:bCs/>
+        </w:rPr>
+        <w:t>4</w:t>
+      </w:r>
+      <w:r>
+        <w:rPr>
+          <w:b/>
+          <w:bCs/>
+        </w:rPr>
+        <w:t>.</w:t>
+      </w:r>
+      <w:r>
+        <w:rPr>
+          <w:b/>
+          <w:bCs/>
+        </w:rPr>
+        <w:t>1</w:t>
+      </w:r>
+      <w:r>
+        <w:rPr>
+          <w:b/>
+          <w:bCs/>
+        </w:rPr>
+        <w:t>. Explicación:</w:t>
+      </w:r>
+      <w:r>
+        <w:t xml:space="preserve"> </w:t>
+      </w:r>
+      <w:r>
+        <w:t>S</w:t>
+      </w:r>
+      <w:r>
+        <w:t xml:space="preserve">e utilizó </w:t>
+      </w:r>
+      <w:r>
+        <w:rPr>
+          <w:bCs/>
+        </w:rPr>
+        <w:t>COUNT y GROUP BY</w:t>
+      </w:r>
+      <w:r>
+        <w:t>, para contar y agrupar los registros de emergencias según cada ubicación dentro de la institución educativa.</w:t>
+      </w:r>
+      <w:r>
+        <w:rPr>
+          <w:rFonts w:asciiTheme="minorHAnsi" w:hAnsiTheme="minorHAnsi"/>
+          <w:b/>
+          <w:bCs/>
+          <w:sz w:val="24"/>
+        </w:rPr>
+        <w:t xml:space="preserve"> </w:t>
+      </w:r>
+      <w:r>
+        <w:rPr>
+          <w:rFonts w:asciiTheme="minorHAnsi" w:hAnsiTheme="minorHAnsi"/>
+          <w:sz w:val="24"/>
+        </w:rPr>
+        <w:t>Acompañado con</w:t>
+      </w:r>
+      <w:r>
+        <w:rPr>
+          <w:rFonts w:asciiTheme="minorHAnsi" w:hAnsiTheme="minorHAnsi"/>
+          <w:sz w:val="24"/>
+        </w:rPr>
+        <w:t xml:space="preserve"> un </w:t>
+      </w:r>
+      <w:r>
+        <w:t>INNER JOIN para relacionar los registros de la tabla “alertas” con las tablas “ubicaciones” e “instituciones”, permitiendo identificar las zonas donde se han registrado</w:t>
+      </w:r>
+      <w:r>
+        <w:t xml:space="preserve"> las emergencias. </w:t>
+      </w:r>
+      <w:r>
+        <w:t xml:space="preserve">Y </w:t>
+      </w:r>
+      <w:r>
+        <w:t>p</w:t>
+      </w:r>
+      <w:r>
+        <w:t xml:space="preserve">ara mostrar únicamente las ubicaciones que </w:t>
+      </w:r>
+      <w:r>
+        <w:t xml:space="preserve">se han </w:t>
+      </w:r>
+      <w:r>
+        <w:t>registrado más de una emergencia, se utilizó HAVING COUNT &gt; 1</w:t>
+      </w:r>
+      <w:r>
+        <w:t xml:space="preserve"> para cuando realice el conteo solo muestre las emergencias mayores a 1</w:t>
+      </w:r>
+      <w:r>
+        <w:t>.</w:t>
+      </w:r>
+    </w:p>
+    <w:p>
+      <w:pPr>
+        <w:pStyle w:val="APASEPTIMA"/>
+        <w:ind w:firstLine="0"/>
+        <w:rPr>
+          <w:b/>
+        </w:rPr>
+      </w:pPr>
+      <w:r>
+        <w:rPr>
+          <w:noProof/>
+        </w:rPr>
+        <w:lastRenderedPageBreak/>
+        <w:drawing>
+          <wp:inline distT="0" distB="0" distL="0" distR="0" wp14:anchorId="73D3D7F7" wp14:editId="382B914D">
+            <wp:extent cx="5943600" cy="1946910"/>
+            <wp:effectExtent l="0" t="0" r="0" b="0"/>
+            <wp:docPr id="597341751" name="Imagen 1"/>
+            <wp:cNvGraphicFramePr>
+              <a:graphicFrameLocks xmlns:a="http://schemas.openxmlformats.org/drawingml/2006/main" noChangeAspect="1"/>
+            </wp:cNvGraphicFramePr>
+            <a:graphic xmlns:a="http://schemas.openxmlformats.org/drawingml/2006/main">
+              <a:graphicData uri="http://schemas.openxmlformats.org/drawingml/2006/picture">
+                <pic:pic xmlns:pic="http://schemas.openxmlformats.org/drawingml/2006/picture">
+                  <pic:nvPicPr>
+                    <pic:cNvPr id="597341751" name=""/>
+                    <pic:cNvPicPr/>
+                  </pic:nvPicPr>
+                  <pic:blipFill>
+                    <a:blip r:embed="rId20"/>
+                    <a:stretch>
+                      <a:fillRect/>
+                    </a:stretch>
+                  </pic:blipFill>
+                  <pic:spPr>
+                    <a:xfrm>
+                      <a:off x="0" y="0"/>
+                      <a:ext cx="5943600" cy="1946910"/>
+                    </a:xfrm>
+                    <a:prstGeom prst="rect">
+                      <a:avLst/>
+                    </a:prstGeom>
+                  </pic:spPr>
+                </pic:pic>
+              </a:graphicData>
+            </a:graphic>
+          </wp:inline>
+        </w:drawing>
+      </w:r>
+    </w:p>
+    <w:p>
+      <w:pPr>
+        <w:pStyle w:val="APASEPTIMA"/>
+        <w:ind w:firstLine="0"/>
+        <w:rPr>
+          <w:bCs/>
+        </w:rPr>
+      </w:pPr>
+      <w:r>
+        <w:rPr>
+          <w:b/>
+          <w:bCs/>
+        </w:rPr>
+        <w:t>5.4.1. Resultado:</w:t>
+      </w:r>
+      <w:r>
+        <w:rPr>
+          <w:b/>
+        </w:rPr>
+        <w:t xml:space="preserve"> </w:t>
+      </w:r>
+      <w:r>
+        <w:rPr>
+          <w:bCs/>
+        </w:rPr>
+        <w:t xml:space="preserve">Con esto se </w:t>
+      </w:r>
+      <w:r>
+        <w:rPr>
+          <w:bCs/>
+        </w:rPr>
+        <w:t xml:space="preserve">obtuvieron exitosamente las ubicaciones que han registrado más de una emergencia, mostrando la cantidad total de emergencias </w:t>
+      </w:r>
+      <w:r>
+        <w:rPr>
+          <w:bCs/>
+        </w:rPr>
+        <w:t>existentes</w:t>
+      </w:r>
+      <w:r>
+        <w:rPr>
+          <w:bCs/>
+        </w:rPr>
+        <w:t xml:space="preserve"> en cada </w:t>
+      </w:r>
+      <w:r>
+        <w:rPr>
+          <w:bCs/>
+        </w:rPr>
+        <w:t>ubicación de la institución educativa</w:t>
+      </w:r>
+      <w:r>
+        <w:rPr>
+          <w:bCs/>
+        </w:rPr>
+        <w:t xml:space="preserve"> y ordenándolas de </w:t>
+      </w:r>
+      <w:r>
+        <w:rPr>
+          <w:bCs/>
+        </w:rPr>
+        <w:t>más reciente a la más antigua</w:t>
+      </w:r>
+      <w:r>
+        <w:rPr>
+          <w:bCs/>
+        </w:rPr>
+        <w:t>.</w:t>
+      </w:r>
+    </w:p>
+    <w:p>
+      <w:pPr>
+        <w:pStyle w:val="APASEPTIMA"/>
+        <w:ind w:firstLine="0"/>
+        <w:rPr>
+          <w:bCs/>
+        </w:rPr>
+      </w:pPr>
+      <w:r>
+        <w:rPr>
+          <w:noProof/>
+        </w:rPr>
+        <w:drawing>
+          <wp:inline distT="0" distB="0" distL="0" distR="0" wp14:anchorId="6977E610" wp14:editId="0924557E">
+            <wp:extent cx="5943600" cy="2778125"/>
+            <wp:effectExtent l="0" t="0" r="0" b="3175"/>
+            <wp:docPr id="1135549786" name="Imagen 1"/>
+            <wp:cNvGraphicFramePr>
+              <a:graphicFrameLocks xmlns:a="http://schemas.openxmlformats.org/drawingml/2006/main" noChangeAspect="1"/>
+            </wp:cNvGraphicFramePr>
+            <a:graphic xmlns:a="http://schemas.openxmlformats.org/drawingml/2006/main">
+              <a:graphicData uri="http://schemas.openxmlformats.org/drawingml/2006/picture">
+                <pic:pic xmlns:pic="http://schemas.openxmlformats.org/drawingml/2006/picture">
+                  <pic:nvPicPr>
+                    <pic:cNvPr id="1135549786" name=""/>
+                    <pic:cNvPicPr/>
+                  </pic:nvPicPr>
+                  <pic:blipFill>
+                    <a:blip r:embed="rId21"/>
+                    <a:stretch>
+                      <a:fillRect/>
+                    </a:stretch>
+                  </pic:blipFill>
+                  <pic:spPr>
+                    <a:xfrm>
+                      <a:off x="0" y="0"/>
+                      <a:ext cx="5943600" cy="2778125"/>
+                    </a:xfrm>
+                    <a:prstGeom prst="rect">
+                      <a:avLst/>
+                    </a:prstGeom>
+                  </pic:spPr>
+                </pic:pic>
+              </a:graphicData>
+            </a:graphic>
+          </wp:inline>
+        </w:drawing>
       </w:r>
     </w:p>
     <w:p>
@@ -1101,7 +3404,7 @@
       </w:r>
     </w:p>
     <w:sectPr>
-      <w:footerReference w:type="default" r:id="rId8"/>
+      <w:footerReference w:type="default" r:id="rId22"/>
       <w:pgSz w:w="12240" w:h="15840" w:code="1"/>
       <w:pgMar w:top="1440" w:right="1440" w:bottom="1440" w:left="1440" w:header="709" w:footer="709" w:gutter="0"/>
       <w:cols w:space="708"/>
@@ -1564,6 +3867,119 @@
     </w:lvl>
   </w:abstractNum>
   <w:abstractNum w:abstractNumId="2" w15:restartNumberingAfterBreak="0">
+    <w:nsid w:val="2FD52873"/>
+    <w:multiLevelType w:val="hybridMultilevel"/>
+    <w:tmpl w:val="04826D98"/>
+    <w:lvl w:ilvl="0" w:tplc="580A0001">
+      <w:start w:val="1"/>
+      <w:numFmt w:val="bullet"/>
+      <w:lvlText w:val=""/>
+      <w:lvlJc w:val="left"/>
+      <w:pPr>
+        <w:ind w:left="720" w:hanging="360"/>
+      </w:pPr>
+      <w:rPr>
+        <w:rFonts w:ascii="Symbol" w:hAnsi="Symbol" w:hint="default"/>
+      </w:rPr>
+    </w:lvl>
+    <w:lvl w:ilvl="1" w:tplc="580A0003" w:tentative="1">
+      <w:start w:val="1"/>
+      <w:numFmt w:val="bullet"/>
+      <w:lvlText w:val="o"/>
+      <w:lvlJc w:val="left"/>
+      <w:pPr>
+        <w:ind w:left="1440" w:hanging="360"/>
+      </w:pPr>
+      <w:rPr>
+        <w:rFonts w:ascii="Courier New" w:hAnsi="Courier New" w:cs="Courier New" w:hint="default"/>
+      </w:rPr>
+    </w:lvl>
+    <w:lvl w:ilvl="2" w:tplc="580A0005" w:tentative="1">
+      <w:start w:val="1"/>
+      <w:numFmt w:val="bullet"/>
+      <w:lvlText w:val=""/>
+      <w:lvlJc w:val="left"/>
+      <w:pPr>
+        <w:ind w:left="2160" w:hanging="360"/>
+      </w:pPr>
+      <w:rPr>
+        <w:rFonts w:ascii="Wingdings" w:hAnsi="Wingdings" w:hint="default"/>
+      </w:rPr>
+    </w:lvl>
+    <w:lvl w:ilvl="3" w:tplc="580A0001" w:tentative="1">
+      <w:start w:val="1"/>
+      <w:numFmt w:val="bullet"/>
+      <w:lvlText w:val=""/>
+      <w:lvlJc w:val="left"/>
+      <w:pPr>
+        <w:ind w:left="2880" w:hanging="360"/>
+      </w:pPr>
+      <w:rPr>
+        <w:rFonts w:ascii="Symbol" w:hAnsi="Symbol" w:hint="default"/>
+      </w:rPr>
+    </w:lvl>
+    <w:lvl w:ilvl="4" w:tplc="580A0003" w:tentative="1">
+      <w:start w:val="1"/>
+      <w:numFmt w:val="bullet"/>
+      <w:lvlText w:val="o"/>
+      <w:lvlJc w:val="left"/>
+      <w:pPr>
+        <w:ind w:left="3600" w:hanging="360"/>
+      </w:pPr>
+      <w:rPr>
+        <w:rFonts w:ascii="Courier New" w:hAnsi="Courier New" w:cs="Courier New" w:hint="default"/>
+      </w:rPr>
+    </w:lvl>
+    <w:lvl w:ilvl="5" w:tplc="580A0005" w:tentative="1">
+      <w:start w:val="1"/>
+      <w:numFmt w:val="bullet"/>
+      <w:lvlText w:val=""/>
+      <w:lvlJc w:val="left"/>
+      <w:pPr>
+        <w:ind w:left="4320" w:hanging="360"/>
+      </w:pPr>
+      <w:rPr>
+        <w:rFonts w:ascii="Wingdings" w:hAnsi="Wingdings" w:hint="default"/>
+      </w:rPr>
+    </w:lvl>
+    <w:lvl w:ilvl="6" w:tplc="580A0001" w:tentative="1">
+      <w:start w:val="1"/>
+      <w:numFmt w:val="bullet"/>
+      <w:lvlText w:val=""/>
+      <w:lvlJc w:val="left"/>
+      <w:pPr>
+        <w:ind w:left="5040" w:hanging="360"/>
+      </w:pPr>
+      <w:rPr>
+        <w:rFonts w:ascii="Symbol" w:hAnsi="Symbol" w:hint="default"/>
+      </w:rPr>
+    </w:lvl>
+    <w:lvl w:ilvl="7" w:tplc="580A0003" w:tentative="1">
+      <w:start w:val="1"/>
+      <w:numFmt w:val="bullet"/>
+      <w:lvlText w:val="o"/>
+      <w:lvlJc w:val="left"/>
+      <w:pPr>
+        <w:ind w:left="5760" w:hanging="360"/>
+      </w:pPr>
+      <w:rPr>
+        <w:rFonts w:ascii="Courier New" w:hAnsi="Courier New" w:cs="Courier New" w:hint="default"/>
+      </w:rPr>
+    </w:lvl>
+    <w:lvl w:ilvl="8" w:tplc="580A0005" w:tentative="1">
+      <w:start w:val="1"/>
+      <w:numFmt w:val="bullet"/>
+      <w:lvlText w:val=""/>
+      <w:lvlJc w:val="left"/>
+      <w:pPr>
+        <w:ind w:left="6480" w:hanging="360"/>
+      </w:pPr>
+      <w:rPr>
+        <w:rFonts w:ascii="Wingdings" w:hAnsi="Wingdings" w:hint="default"/>
+      </w:rPr>
+    </w:lvl>
+  </w:abstractNum>
+  <w:abstractNum w:abstractNumId="3" w15:restartNumberingAfterBreak="0">
     <w:nsid w:val="4E513C43"/>
     <w:multiLevelType w:val="hybridMultilevel"/>
     <w:tmpl w:val="6C988A96"/>
@@ -1652,7 +4068,120 @@
       </w:pPr>
     </w:lvl>
   </w:abstractNum>
-  <w:abstractNum w:abstractNumId="3" w15:restartNumberingAfterBreak="0">
+  <w:abstractNum w:abstractNumId="4" w15:restartNumberingAfterBreak="0">
+    <w:nsid w:val="536D3B8A"/>
+    <w:multiLevelType w:val="hybridMultilevel"/>
+    <w:tmpl w:val="979CA468"/>
+    <w:lvl w:ilvl="0" w:tplc="580A0001">
+      <w:start w:val="1"/>
+      <w:numFmt w:val="bullet"/>
+      <w:lvlText w:val=""/>
+      <w:lvlJc w:val="left"/>
+      <w:pPr>
+        <w:ind w:left="720" w:hanging="360"/>
+      </w:pPr>
+      <w:rPr>
+        <w:rFonts w:ascii="Symbol" w:hAnsi="Symbol" w:hint="default"/>
+      </w:rPr>
+    </w:lvl>
+    <w:lvl w:ilvl="1" w:tplc="580A0003" w:tentative="1">
+      <w:start w:val="1"/>
+      <w:numFmt w:val="bullet"/>
+      <w:lvlText w:val="o"/>
+      <w:lvlJc w:val="left"/>
+      <w:pPr>
+        <w:ind w:left="1440" w:hanging="360"/>
+      </w:pPr>
+      <w:rPr>
+        <w:rFonts w:ascii="Courier New" w:hAnsi="Courier New" w:cs="Courier New" w:hint="default"/>
+      </w:rPr>
+    </w:lvl>
+    <w:lvl w:ilvl="2" w:tplc="580A0005" w:tentative="1">
+      <w:start w:val="1"/>
+      <w:numFmt w:val="bullet"/>
+      <w:lvlText w:val=""/>
+      <w:lvlJc w:val="left"/>
+      <w:pPr>
+        <w:ind w:left="2160" w:hanging="360"/>
+      </w:pPr>
+      <w:rPr>
+        <w:rFonts w:ascii="Wingdings" w:hAnsi="Wingdings" w:hint="default"/>
+      </w:rPr>
+    </w:lvl>
+    <w:lvl w:ilvl="3" w:tplc="580A0001" w:tentative="1">
+      <w:start w:val="1"/>
+      <w:numFmt w:val="bullet"/>
+      <w:lvlText w:val=""/>
+      <w:lvlJc w:val="left"/>
+      <w:pPr>
+        <w:ind w:left="2880" w:hanging="360"/>
+      </w:pPr>
+      <w:rPr>
+        <w:rFonts w:ascii="Symbol" w:hAnsi="Symbol" w:hint="default"/>
+      </w:rPr>
+    </w:lvl>
+    <w:lvl w:ilvl="4" w:tplc="580A0003" w:tentative="1">
+      <w:start w:val="1"/>
+      <w:numFmt w:val="bullet"/>
+      <w:lvlText w:val="o"/>
+      <w:lvlJc w:val="left"/>
+      <w:pPr>
+        <w:ind w:left="3600" w:hanging="360"/>
+      </w:pPr>
+      <w:rPr>
+        <w:rFonts w:ascii="Courier New" w:hAnsi="Courier New" w:cs="Courier New" w:hint="default"/>
+      </w:rPr>
+    </w:lvl>
+    <w:lvl w:ilvl="5" w:tplc="580A0005" w:tentative="1">
+      <w:start w:val="1"/>
+      <w:numFmt w:val="bullet"/>
+      <w:lvlText w:val=""/>
+      <w:lvlJc w:val="left"/>
+      <w:pPr>
+        <w:ind w:left="4320" w:hanging="360"/>
+      </w:pPr>
+      <w:rPr>
+        <w:rFonts w:ascii="Wingdings" w:hAnsi="Wingdings" w:hint="default"/>
+      </w:rPr>
+    </w:lvl>
+    <w:lvl w:ilvl="6" w:tplc="580A0001" w:tentative="1">
+      <w:start w:val="1"/>
+      <w:numFmt w:val="bullet"/>
+      <w:lvlText w:val=""/>
+      <w:lvlJc w:val="left"/>
+      <w:pPr>
+        <w:ind w:left="5040" w:hanging="360"/>
+      </w:pPr>
+      <w:rPr>
+        <w:rFonts w:ascii="Symbol" w:hAnsi="Symbol" w:hint="default"/>
+      </w:rPr>
+    </w:lvl>
+    <w:lvl w:ilvl="7" w:tplc="580A0003" w:tentative="1">
+      <w:start w:val="1"/>
+      <w:numFmt w:val="bullet"/>
+      <w:lvlText w:val="o"/>
+      <w:lvlJc w:val="left"/>
+      <w:pPr>
+        <w:ind w:left="5760" w:hanging="360"/>
+      </w:pPr>
+      <w:rPr>
+        <w:rFonts w:ascii="Courier New" w:hAnsi="Courier New" w:cs="Courier New" w:hint="default"/>
+      </w:rPr>
+    </w:lvl>
+    <w:lvl w:ilvl="8" w:tplc="580A0005" w:tentative="1">
+      <w:start w:val="1"/>
+      <w:numFmt w:val="bullet"/>
+      <w:lvlText w:val=""/>
+      <w:lvlJc w:val="left"/>
+      <w:pPr>
+        <w:ind w:left="6480" w:hanging="360"/>
+      </w:pPr>
+      <w:rPr>
+        <w:rFonts w:ascii="Wingdings" w:hAnsi="Wingdings" w:hint="default"/>
+      </w:rPr>
+    </w:lvl>
+  </w:abstractNum>
+  <w:abstractNum w:abstractNumId="5" w15:restartNumberingAfterBreak="0">
     <w:nsid w:val="5C3A5E34"/>
     <w:multiLevelType w:val="multilevel"/>
     <w:tmpl w:val="99446CE0"/>
@@ -1801,7 +4330,7 @@
       </w:rPr>
     </w:lvl>
   </w:abstractNum>
-  <w:abstractNum w:abstractNumId="4" w15:restartNumberingAfterBreak="0">
+  <w:abstractNum w:abstractNumId="6" w15:restartNumberingAfterBreak="0">
     <w:nsid w:val="6C3D348B"/>
     <w:multiLevelType w:val="multilevel"/>
     <w:tmpl w:val="E73A4DD2"/>
@@ -1950,7 +4479,7 @@
       </w:rPr>
     </w:lvl>
   </w:abstractNum>
-  <w:abstractNum w:abstractNumId="5" w15:restartNumberingAfterBreak="0">
+  <w:abstractNum w:abstractNumId="7" w15:restartNumberingAfterBreak="0">
     <w:nsid w:val="6FD76990"/>
     <w:multiLevelType w:val="hybridMultilevel"/>
     <w:tmpl w:val="E09ECB36"/>
@@ -2043,19 +4572,25 @@
     <w:abstractNumId w:val="1"/>
   </w:num>
   <w:num w:numId="2" w16cid:durableId="663553834">
-    <w:abstractNumId w:val="3"/>
+    <w:abstractNumId w:val="5"/>
   </w:num>
   <w:num w:numId="3" w16cid:durableId="869029596">
     <w:abstractNumId w:val="0"/>
   </w:num>
   <w:num w:numId="4" w16cid:durableId="2134984317">
-    <w:abstractNumId w:val="4"/>
+    <w:abstractNumId w:val="6"/>
   </w:num>
   <w:num w:numId="5" w16cid:durableId="836766882">
+    <w:abstractNumId w:val="3"/>
+  </w:num>
+  <w:num w:numId="6" w16cid:durableId="393049868">
+    <w:abstractNumId w:val="7"/>
+  </w:num>
+  <w:num w:numId="7" w16cid:durableId="1979140752">
     <w:abstractNumId w:val="2"/>
   </w:num>
-  <w:num w:numId="6" w16cid:durableId="393049868">
-    <w:abstractNumId w:val="5"/>
+  <w:num w:numId="8" w16cid:durableId="182212478">
+    <w:abstractNumId w:val="4"/>
   </w:num>
 </w:numbering>
 </file>
@@ -2488,7 +5023,6 @@
     <w:next w:val="Normal"/>
     <w:link w:val="Ttulo2Car"/>
     <w:uiPriority w:val="9"/>
-    <w:semiHidden/>
     <w:unhideWhenUsed/>
     <w:qFormat/>
     <w:rsid w:val="00AA294C"/>
@@ -2729,7 +5263,6 @@
     <w:basedOn w:val="Fuentedeprrafopredeter"/>
     <w:link w:val="Ttulo2"/>
     <w:uiPriority w:val="9"/>
-    <w:semiHidden/>
     <w:rsid w:val="00AA294C"/>
     <w:rPr>
       <w:rFonts w:ascii="Arial" w:eastAsiaTheme="majorEastAsia" w:hAnsi="Arial" w:cstheme="majorBidi"/>
@@ -3071,6 +5604,169 @@
       <w:sz w:val="22"/>
     </w:rPr>
   </w:style>
+  <w:style w:type="table" w:styleId="Tablaconcuadrcula">
+    <w:name w:val="Table Grid"/>
+    <w:basedOn w:val="Tablanormal"/>
+    <w:uiPriority w:val="39"/>
+    <w:rsid w:val="003069B4"/>
+    <w:pPr>
+      <w:spacing w:after="0" w:line="240" w:lineRule="auto"/>
+    </w:pPr>
+    <w:tblPr>
+      <w:tblBorders>
+        <w:top w:val="single" w:sz="4" w:space="0" w:color="auto"/>
+        <w:left w:val="single" w:sz="4" w:space="0" w:color="auto"/>
+        <w:bottom w:val="single" w:sz="4" w:space="0" w:color="auto"/>
+        <w:right w:val="single" w:sz="4" w:space="0" w:color="auto"/>
+        <w:insideH w:val="single" w:sz="4" w:space="0" w:color="auto"/>
+        <w:insideV w:val="single" w:sz="4" w:space="0" w:color="auto"/>
+      </w:tblBorders>
+    </w:tblPr>
+  </w:style>
+  <w:style w:type="table" w:styleId="Tablanormal1">
+    <w:name w:val="Plain Table 1"/>
+    <w:basedOn w:val="Tablanormal"/>
+    <w:uiPriority w:val="41"/>
+    <w:rsid w:val="004272CF"/>
+    <w:pPr>
+      <w:spacing w:after="0" w:line="240" w:lineRule="auto"/>
+    </w:pPr>
+    <w:tblPr>
+      <w:tblStyleRowBandSize w:val="1"/>
+      <w:tblStyleColBandSize w:val="1"/>
+      <w:tblBorders>
+        <w:top w:val="single" w:sz="4" w:space="0" w:color="BFBFBF" w:themeColor="background1" w:themeShade="BF"/>
+        <w:left w:val="single" w:sz="4" w:space="0" w:color="BFBFBF" w:themeColor="background1" w:themeShade="BF"/>
+        <w:bottom w:val="single" w:sz="4" w:space="0" w:color="BFBFBF" w:themeColor="background1" w:themeShade="BF"/>
+        <w:right w:val="single" w:sz="4" w:space="0" w:color="BFBFBF" w:themeColor="background1" w:themeShade="BF"/>
+        <w:insideH w:val="single" w:sz="4" w:space="0" w:color="BFBFBF" w:themeColor="background1" w:themeShade="BF"/>
+        <w:insideV w:val="single" w:sz="4" w:space="0" w:color="BFBFBF" w:themeColor="background1" w:themeShade="BF"/>
+      </w:tblBorders>
+    </w:tblPr>
+    <w:tblStylePr w:type="firstRow">
+      <w:rPr>
+        <w:b/>
+        <w:bCs/>
+      </w:rPr>
+    </w:tblStylePr>
+    <w:tblStylePr w:type="lastRow">
+      <w:rPr>
+        <w:b/>
+        <w:bCs/>
+      </w:rPr>
+      <w:tblPr/>
+      <w:tcPr>
+        <w:tcBorders>
+          <w:top w:val="double" w:sz="4" w:space="0" w:color="BFBFBF" w:themeColor="background1" w:themeShade="BF"/>
+        </w:tcBorders>
+      </w:tcPr>
+    </w:tblStylePr>
+    <w:tblStylePr w:type="firstCol">
+      <w:rPr>
+        <w:b/>
+        <w:bCs/>
+      </w:rPr>
+    </w:tblStylePr>
+    <w:tblStylePr w:type="lastCol">
+      <w:rPr>
+        <w:b/>
+        <w:bCs/>
+      </w:rPr>
+    </w:tblStylePr>
+    <w:tblStylePr w:type="band1Vert">
+      <w:tblPr/>
+      <w:tcPr>
+        <w:shd w:val="clear" w:color="auto" w:fill="F2F2F2" w:themeFill="background1" w:themeFillShade="F2"/>
+      </w:tcPr>
+    </w:tblStylePr>
+    <w:tblStylePr w:type="band1Horz">
+      <w:tblPr/>
+      <w:tcPr>
+        <w:shd w:val="clear" w:color="auto" w:fill="F2F2F2" w:themeFill="background1" w:themeFillShade="F2"/>
+      </w:tcPr>
+    </w:tblStylePr>
+  </w:style>
+  <w:style w:type="character" w:styleId="Hipervnculo">
+    <w:name w:val="Hyperlink"/>
+    <w:basedOn w:val="Fuentedeprrafopredeter"/>
+    <w:uiPriority w:val="99"/>
+    <w:unhideWhenUsed/>
+    <w:rsid w:val="004F0296"/>
+    <w:rPr>
+      <w:color w:val="0563C1" w:themeColor="hyperlink"/>
+      <w:u w:val="single"/>
+    </w:rPr>
+  </w:style>
+  <w:style w:type="character" w:styleId="Mencinsinresolver">
+    <w:name w:val="Unresolved Mention"/>
+    <w:basedOn w:val="Fuentedeprrafopredeter"/>
+    <w:uiPriority w:val="99"/>
+    <w:semiHidden/>
+    <w:unhideWhenUsed/>
+    <w:rsid w:val="004F0296"/>
+    <w:rPr>
+      <w:color w:val="605E5C"/>
+      <w:shd w:val="clear" w:color="auto" w:fill="E1DFDD"/>
+    </w:rPr>
+  </w:style>
+  <w:style w:type="paragraph" w:styleId="Sinespaciado">
+    <w:name w:val="No Spacing"/>
+    <w:uiPriority w:val="1"/>
+    <w:qFormat/>
+    <w:rsid w:val="004F39C3"/>
+    <w:pPr>
+      <w:spacing w:after="0" w:line="240" w:lineRule="auto"/>
+    </w:pPr>
+  </w:style>
+  <w:style w:type="paragraph" w:styleId="TtuloTDC">
+    <w:name w:val="TOC Heading"/>
+    <w:basedOn w:val="Ttulo1"/>
+    <w:next w:val="Normal"/>
+    <w:uiPriority w:val="39"/>
+    <w:unhideWhenUsed/>
+    <w:qFormat/>
+    <w:rsid w:val="007D72CD"/>
+    <w:pPr>
+      <w:spacing w:before="240" w:line="259" w:lineRule="auto"/>
+      <w:jc w:val="left"/>
+      <w:outlineLvl w:val="9"/>
+    </w:pPr>
+    <w:rPr>
+      <w:rFonts w:asciiTheme="majorHAnsi" w:hAnsiTheme="majorHAnsi"/>
+      <w:b w:val="0"/>
+      <w:color w:val="2F5496" w:themeColor="accent1" w:themeShade="BF"/>
+      <w:kern w:val="0"/>
+      <w:sz w:val="32"/>
+      <w:szCs w:val="32"/>
+      <w:lang w:eastAsia="es-419"/>
+      <w14:ligatures w14:val="none"/>
+    </w:rPr>
+  </w:style>
+  <w:style w:type="paragraph" w:styleId="TDC1">
+    <w:name w:val="toc 1"/>
+    <w:basedOn w:val="Normal"/>
+    <w:next w:val="Normal"/>
+    <w:autoRedefine/>
+    <w:uiPriority w:val="39"/>
+    <w:unhideWhenUsed/>
+    <w:rsid w:val="007D72CD"/>
+    <w:pPr>
+      <w:spacing w:after="100"/>
+    </w:pPr>
+  </w:style>
+  <w:style w:type="paragraph" w:styleId="TDC2">
+    <w:name w:val="toc 2"/>
+    <w:basedOn w:val="Normal"/>
+    <w:next w:val="Normal"/>
+    <w:autoRedefine/>
+    <w:uiPriority w:val="39"/>
+    <w:unhideWhenUsed/>
+    <w:rsid w:val="007D72CD"/>
+    <w:pPr>
+      <w:spacing w:after="100"/>
+      <w:ind w:left="240"/>
+    </w:pPr>
+  </w:style>
 </w:styles>
 </file>
 
@@ -3367,4 +6063,16 @@
     </a:ext>
   </a:extLst>
 </a:theme>
+</file>
+
+<file path=customXml/item1.xml><?xml version="1.0" encoding="utf-8"?>
+<b:Sources xmlns:b="http://schemas.openxmlformats.org/officeDocument/2006/bibliography" xmlns="http://schemas.openxmlformats.org/officeDocument/2006/bibliography" SelectedStyle="\APASixthEditionOfficeOnline.xsl" StyleName="APA" Version="6"/>
+</file>
+
+<file path=customXml/itemProps1.xml><?xml version="1.0" encoding="utf-8"?>
+<ds:datastoreItem xmlns:ds="http://schemas.openxmlformats.org/officeDocument/2006/customXml" ds:itemID="{A39869B3-02CB-400C-A21B-07D94278F502}">
+  <ds:schemaRefs>
+    <ds:schemaRef ds:uri="http://schemas.openxmlformats.org/officeDocument/2006/bibliography"/>
+  </ds:schemaRefs>
+</ds:datastoreItem>
 </file>
</xml_diff>